<commit_message>
Correct V2 independent-review synthesis records
</commit_message>
<xml_diff>
--- a/evidence/v2/independent-review/CLAUDE_WOJCIECH_V2_CROSS_REVIEW_ADJUDICATION.docx
+++ b/evidence/v2/independent-review/CLAUDE_WOJCIECH_V2_CROSS_REVIEW_ADJUDICATION.docx
@@ -896,7 +896,7 @@
               <w:rPr>
                 <w:sz w:val="16"/>
               </w:rPr>
-              <w:t>CANNOT DISCRIMINATE - lineage is recorded and auditable but not independently consumed as an execution predicate after boundary creation.</w:t>
+              <w:t>CANNOT DISCRIMINATE - lineage is recorded and auditable but not independently consumed as an execution predicate after boundary creation. Wojciech also cautioned that the normal governed pipeline may already prevent illegitimate lineage upstream.</w:t>
             </w:r>
           </w:p>
         </w:tc>
@@ -919,7 +919,7 @@
               <w:rPr>
                 <w:sz w:val="16"/>
               </w:rPr>
-              <w:t>WOJCIECH-UNIQUE FINDING.</w:t>
+              <w:t>WOJCIECH-UNIQUE FINDING, WITH IMPORTANT QUALIFICATION: this does not establish that normal governed V2 runs routinely create illegitimate authority lineage.</w:t>
             </w:r>
           </w:p>
         </w:tc>
@@ -1537,7 +1537,45 @@
         <w:keepNext/>
       </w:pPr>
       <w:r>
-        <w:t>6. Current Adjudication by Finding</w:t>
+        <w:t>6. Review-Basis Correction and Preserved Qualifications</w:t>
+      </w:r>
+    </w:p>
+    <w:p>
+      <w:r>
+        <w:t>A raw-thread-to-final-assessment audit performed after the first cross-review confirmed that Wojciech's nine frozen classifications were accurately preserved, but identified additional context that needed to be explicit in the canonical synthesis. This corrected cross-review incorporates that context without changing any of Wojciech's frozen classifications.</w:t>
+      </w:r>
+    </w:p>
+    <w:p>
+      <w:pPr>
+        <w:pStyle w:val="ListBullet"/>
+      </w:pPr>
+      <w:r>
+        <w:t>Governing-provenance qualification: Wojciech did not conclude that normal governed V2 runs routinely produce illegitimate lineage. He explicitly noted that the governed pipeline performs important legitimacy work upstream and may prevent such a boundary from being constructed through the normal path. The execution-layer discrimination limit therefore remains a representation boundary, not evidence of ordinary-path failure.</w:t>
+      </w:r>
+    </w:p>
+    <w:p>
+      <w:pPr>
+        <w:pStyle w:val="ListBullet"/>
+      </w:pPr>
+      <w:r>
+        <w:t>Attack-to-result traceability: the corrected Wojciech assessment now maps the original and closing attack agenda to their final dispositions, including attacks that survived, narrowed, collapsed into another finding, or reached a representation boundary.</w:t>
+      </w:r>
+    </w:p>
+    <w:p>
+      <w:pPr>
+        <w:pStyle w:val="ListBullet"/>
+      </w:pPr>
+      <w:r>
+        <w:t>Explicitly parked upstream research: authority-to-authorize/actor standing, recursion termination, possible trust anchors, and authority continuity/termination were consciously kept outside the frozen V2 findings. Their presence in the raw exchange must not be mistaken either for omissions in thinking or for approved future architecture.</w:t>
+      </w:r>
+    </w:p>
+    <w:p>
+      <w:pPr>
+        <w:pStyle w:val="Heading1"/>
+        <w:keepNext/>
+      </w:pPr>
+      <w:r>
+        <w:t>7. Current Adjudication by Finding</w:t>
       </w:r>
     </w:p>
     <w:tbl>
@@ -2068,7 +2106,7 @@
               <w:rPr>
                 <w:sz w:val="17"/>
               </w:rPr>
-              <w:t>V2 preserves lineage as evidence but does not independently consume lineage legitimacy as an execution predicate after boundary creation.</w:t>
+              <w:t>V2 preserves lineage as evidence but does not independently consume lineage legitimacy as an execution predicate after boundary creation. This execution-layer limit is not evidence that the normal governed pipeline routinely constructs illegitimate lineage; Wojciech explicitly noted that upstream pipeline logic may prevent that condition in ordinary governed runs.</w:t>
             </w:r>
           </w:p>
         </w:tc>
@@ -2380,7 +2418,7 @@
         <w:keepNext/>
       </w:pPr>
       <w:r>
-        <w:t>7. Sharpened V2 Claim Boundary</w:t>
+        <w:t>8. Sharpened V2 Claim Boundary</w:t>
       </w:r>
     </w:p>
     <w:p>
@@ -2411,7 +2449,7 @@
         <w:keepNext/>
       </w:pPr>
       <w:r>
-        <w:t>8. Required Next Steps Before Any V2 Change</w:t>
+        <w:t>9. Required Next Steps Before Any V2 Change</w:t>
       </w:r>
     </w:p>
     <w:p>
@@ -2484,7 +2522,7 @@
         <w:keepNext/>
       </w:pPr>
       <w:r>
-        <w:t>9. Independence and Disclosure Rule</w:t>
+        <w:t>10. Independence and Disclosure Rule</w:t>
       </w:r>
     </w:p>
     <w:p>
@@ -2498,7 +2536,7 @@
         <w:keepNext/>
       </w:pPr>
       <w:r>
-        <w:t>10. Canonical Cross-Review Takeaway</w:t>
+        <w:t>11. Canonical Cross-Review Takeaway</w:t>
       </w:r>
     </w:p>
     <w:p>
@@ -2534,7 +2572,7 @@
         <w:pStyle w:val="ListBullet"/>
       </w:pPr>
       <w:r>
-        <w:t>Wojciech V2 Final Independent Adversarial Assessment, including the frozen classifications for causal boundary enforcement, temporal continuity, governing provenance, replay, policy/scenario drift, semantic decision-object identity, and the known wrong-boundary limit.</w:t>
+        <w:t>Corrected Wojciech V2 Final Independent Adversarial Assessment, reconciled against the preserved raw LinkedIn message thread. The nine frozen classifications are unchanged; the corrected synthesis additionally preserves the normal-governed-pipeline qualification, the attack-to-result ledger, and explicitly parked upstream research questions.</w:t>
       </w:r>
     </w:p>
     <w:p>

</xml_diff>

<commit_message>
Rebuild Claude-Wojciech V2 cross-review adjudication
</commit_message>
<xml_diff>
--- a/evidence/v2/independent-review/CLAUDE_WOJCIECH_V2_CROSS_REVIEW_ADJUDICATION.docx
+++ b/evidence/v2/independent-review/CLAUDE_WOJCIECH_V2_CROSS_REVIEW_ADJUDICATION.docx
@@ -5,34 +5,514 @@
     <w:p>
       <w:pPr>
         <w:pStyle w:val="Title"/>
-        <w:jc w:val="center"/>
+        <w:jc w:val="left"/>
       </w:pPr>
       <w:r>
+        <w:rPr>
+          <w:color w:val="232323"/>
+        </w:rPr>
         <w:t>Claude / Wojciech V2 Cross-Review Adjudication</w:t>
       </w:r>
     </w:p>
     <w:p>
       <w:pPr>
-        <w:jc w:val="center"/>
+        <w:spacing w:after="280"/>
+      </w:pPr>
+      <w:r>
+        <w:rPr>
+          <w:i/>
+          <w:color w:val="5A5A5A"/>
+          <w:sz w:val="22"/>
+        </w:rPr>
+        <w:t>Final evidence synthesis after independent review and controlled post-disclosure comparison</w:t>
+      </w:r>
+    </w:p>
+    <w:tbl>
+      <w:tblPr>
+        <w:tblW w:type="auto" w:w="0"/>
+        <w:jc w:val="left"/>
+        <w:tblLayout w:type="fixed"/>
+        <w:tblLook w:firstColumn="1" w:firstRow="1" w:lastColumn="0" w:lastRow="0" w:noHBand="0" w:noVBand="1" w:val="04A0"/>
+      </w:tblPr>
+      <w:tblGrid>
+        <w:gridCol w:w="4939"/>
+        <w:gridCol w:w="4939"/>
+      </w:tblGrid>
+      <w:tr>
+        <w:tc>
+          <w:tcPr>
+            <w:tcW w:type="dxa" w:w="4939"/>
+            <w:tcMar>
+              <w:top w:w="80" w:type="dxa"/>
+              <w:start w:w="120" w:type="dxa"/>
+              <w:bottom w:w="80" w:type="dxa"/>
+              <w:end w:w="120" w:type="dxa"/>
+            </w:tcMar>
+            <w:vAlign w:val="center"/>
+          </w:tcPr>
+          <w:p>
+            <w:r>
+              <w:rPr>
+                <w:b/>
+              </w:rPr>
+              <w:t>Document status</w:t>
+            </w:r>
+          </w:p>
+        </w:tc>
+        <w:tc>
+          <w:tcPr>
+            <w:tcW w:type="dxa" w:w="4939"/>
+            <w:tcMar>
+              <w:top w:w="80" w:type="dxa"/>
+              <w:start w:w="120" w:type="dxa"/>
+              <w:bottom w:w="80" w:type="dxa"/>
+              <w:end w:w="120" w:type="dxa"/>
+            </w:tcMar>
+            <w:vAlign w:val="center"/>
+          </w:tcPr>
+          <w:p>
+            <w:r>
+              <w:t>Post-freeze cross-review adjudication</w:t>
+            </w:r>
+          </w:p>
+        </w:tc>
+      </w:tr>
+      <w:tr>
+        <w:tc>
+          <w:tcPr>
+            <w:tcW w:type="dxa" w:w="4939"/>
+            <w:tcMar>
+              <w:top w:w="80" w:type="dxa"/>
+              <w:start w:w="120" w:type="dxa"/>
+              <w:bottom w:w="80" w:type="dxa"/>
+              <w:end w:w="120" w:type="dxa"/>
+            </w:tcMar>
+            <w:vAlign w:val="center"/>
+          </w:tcPr>
+          <w:p>
+            <w:r>
+              <w:rPr>
+                <w:b/>
+              </w:rPr>
+              <w:t>Frozen V2 release</w:t>
+            </w:r>
+          </w:p>
+        </w:tc>
+        <w:tc>
+          <w:tcPr>
+            <w:tcW w:type="dxa" w:w="4939"/>
+            <w:tcMar>
+              <w:top w:w="80" w:type="dxa"/>
+              <w:start w:w="120" w:type="dxa"/>
+              <w:bottom w:w="80" w:type="dxa"/>
+              <w:end w:w="120" w:type="dxa"/>
+            </w:tcMar>
+            <w:vAlign w:val="center"/>
+          </w:tcPr>
+          <w:p>
+            <w:r>
+              <w:t>v2.0.0 - bf28fe7cecdc7c406b96b574377abbc220e765d6</w:t>
+            </w:r>
+          </w:p>
+        </w:tc>
+      </w:tr>
+      <w:tr>
+        <w:tc>
+          <w:tcPr>
+            <w:tcW w:type="dxa" w:w="4939"/>
+            <w:tcMar>
+              <w:top w:w="80" w:type="dxa"/>
+              <w:start w:w="120" w:type="dxa"/>
+              <w:bottom w:w="80" w:type="dxa"/>
+              <w:end w:w="120" w:type="dxa"/>
+            </w:tcMar>
+            <w:vAlign w:val="center"/>
+          </w:tcPr>
+          <w:p>
+            <w:r>
+              <w:rPr>
+                <w:b/>
+              </w:rPr>
+              <w:t>Reviewer independence</w:t>
+            </w:r>
+          </w:p>
+        </w:tc>
+        <w:tc>
+          <w:tcPr>
+            <w:tcW w:type="dxa" w:w="4939"/>
+            <w:tcMar>
+              <w:top w:w="80" w:type="dxa"/>
+              <w:start w:w="120" w:type="dxa"/>
+              <w:bottom w:w="80" w:type="dxa"/>
+              <w:end w:w="120" w:type="dxa"/>
+            </w:tcMar>
+            <w:vAlign w:val="center"/>
+          </w:tcPr>
+          <w:p>
+            <w:r>
+              <w:t>Claude and Wojciech findings were frozen independently before cross-disclosure</w:t>
+            </w:r>
+          </w:p>
+        </w:tc>
+      </w:tr>
+      <w:tr>
+        <w:tc>
+          <w:tcPr>
+            <w:tcW w:type="dxa" w:w="4939"/>
+            <w:tcMar>
+              <w:top w:w="80" w:type="dxa"/>
+              <w:start w:w="120" w:type="dxa"/>
+              <w:bottom w:w="80" w:type="dxa"/>
+              <w:end w:w="120" w:type="dxa"/>
+            </w:tcMar>
+            <w:vAlign w:val="center"/>
+          </w:tcPr>
+          <w:p>
+            <w:r>
+              <w:rPr>
+                <w:b/>
+              </w:rPr>
+              <w:t>Authority effect</w:t>
+            </w:r>
+          </w:p>
+        </w:tc>
+        <w:tc>
+          <w:tcPr>
+            <w:tcW w:type="dxa" w:w="4939"/>
+            <w:tcMar>
+              <w:top w:w="80" w:type="dxa"/>
+              <w:start w:w="120" w:type="dxa"/>
+              <w:bottom w:w="80" w:type="dxa"/>
+              <w:end w:w="120" w:type="dxa"/>
+            </w:tcMar>
+            <w:vAlign w:val="center"/>
+          </w:tcPr>
+          <w:p>
+            <w:r>
+              <w:t>No V2 software, frozen reviewer artifact, test result, or prior finding is amended by this document</w:t>
+            </w:r>
+          </w:p>
+        </w:tc>
+      </w:tr>
+    </w:tbl>
+    <w:p>
+      <w:pPr>
+        <w:spacing w:before="0" w:after="120"/>
+      </w:pPr>
+      <w:r>
+        <w:rPr>
+          <w:b w:val="0"/>
+          <w:i w:val="0"/>
+        </w:rPr>
+      </w:r>
+    </w:p>
+    <w:p>
+      <w:pPr>
+        <w:pStyle w:val="Heading1"/>
+        <w:keepNext/>
+      </w:pPr>
+      <w:r>
+        <w:t>1. Purpose and claims discipline</w:t>
+      </w:r>
+    </w:p>
+    <w:p>
+      <w:pPr>
+        <w:spacing w:before="0" w:after="120"/>
+      </w:pPr>
+      <w:r>
+        <w:rPr>
+          <w:b w:val="0"/>
+          <w:i w:val="0"/>
+        </w:rPr>
+        <w:t>This document adjudicates the combined evidence produced by two independent adversarial reviews of Operational AI Authority Test Harness V2.0.0. It does not rewrite either review, retrospectively repair V2, or convert reviewer observations into claims stronger than the evidence supports.</w:t>
+      </w:r>
+    </w:p>
+    <w:p>
+      <w:pPr>
+        <w:spacing w:before="0" w:after="120"/>
+      </w:pPr>
+      <w:r>
+        <w:rPr>
+          <w:b w:val="0"/>
+          <w:i w:val="0"/>
+        </w:rPr>
+        <w:t>The harness remains a test harness rather than a proof machine. Findings below therefore distinguish what was observed or demonstrated in the represented and tested system from what remains unsupported, unresolved, outside representation, or a research question.</w:t>
+      </w:r>
+    </w:p>
+    <w:p>
+      <w:pPr>
+        <w:pStyle w:val="Heading1"/>
+        <w:keepNext/>
+      </w:pPr>
+      <w:r>
+        <w:t>2. Evidence provenance and sequencing</w:t>
+      </w:r>
+    </w:p>
+    <w:p>
+      <w:pPr>
+        <w:spacing w:before="0" w:after="120"/>
+      </w:pPr>
+      <w:r>
+        <w:rPr>
+          <w:b w:val="0"/>
+          <w:i w:val="0"/>
+        </w:rPr>
+        <w:t>The evidentiary sequence matters because the value of convergence depends on preserving reviewer independence. The final synthesis therefore separates five phases.</w:t>
+      </w:r>
+    </w:p>
+    <w:p>
+      <w:pPr>
+        <w:spacing w:after="100"/>
       </w:pPr>
       <w:r>
         <w:rPr>
           <w:b/>
-          <w:sz w:val="23"/>
         </w:rPr>
-        <w:t>Operational AI Authority Test Harness - Version 2.0.0</w:t>
+        <w:t xml:space="preserve">A. Claude independent evidence: </w:t>
+      </w:r>
+      <w:r>
+        <w:t>Claude's frozen adversarial review and supporting case/evidence records.</w:t>
       </w:r>
     </w:p>
     <w:p>
       <w:pPr>
-        <w:jc w:val="center"/>
+        <w:spacing w:after="100"/>
       </w:pPr>
       <w:r>
         <w:rPr>
-          <w:i/>
-          <w:sz w:val="21"/>
+          <w:b/>
         </w:rPr>
-        <w:t>Post-freeze comparison of independent adversarial evidence</w:t>
+        <w:t xml:space="preserve">B. Wojciech frozen independent evidence: </w:t>
+      </w:r>
+      <w:r>
+        <w:t>Wojciech's final independent adversarial assessment, confirmed final and frozen before disclosure of Claude's review.</w:t>
+      </w:r>
+    </w:p>
+    <w:p>
+      <w:pPr>
+        <w:spacing w:after="100"/>
+      </w:pPr>
+      <w:r>
+        <w:rPr>
+          <w:b/>
+        </w:rPr>
+        <w:t xml:space="preserve">C. Pre-disclosure cross-review synthesis: </w:t>
+      </w:r>
+      <w:r>
+        <w:t>The earlier Claude/Wojciech adjudication prepared before Wojciech saw Claude's review. Git history preserves that synthesis.</w:t>
+      </w:r>
+    </w:p>
+    <w:p>
+      <w:pPr>
+        <w:spacing w:after="100"/>
+      </w:pPr>
+      <w:r>
+        <w:rPr>
+          <w:b/>
+        </w:rPr>
+        <w:t xml:space="preserve">D. Wojciech post-disclosure analysis: </w:t>
+      </w:r>
+      <w:r>
+        <w:t>Wojciech's reaction after reading Claude as a separate evidence stream and before seeing the cross-review comparison. His frozen V2 assessment explicitly did not change.</w:t>
+      </w:r>
+    </w:p>
+    <w:p>
+      <w:pPr>
+        <w:spacing w:after="100"/>
+      </w:pPr>
+      <w:r>
+        <w:rPr>
+          <w:b/>
+        </w:rPr>
+        <w:t xml:space="preserve">E. Final cross-review adjudication: </w:t>
+      </w:r>
+      <w:r>
+        <w:t>This document: a synthesis of convergence, divergence, layer-dependent findings, unresolved questions, and the new post-disclosure fidelity question.</w:t>
+      </w:r>
+    </w:p>
+    <w:p>
+      <w:pPr>
+        <w:spacing w:before="0" w:after="120"/>
+      </w:pPr>
+      <w:r>
+        <w:rPr>
+          <w:b w:val="0"/>
+          <w:i w:val="0"/>
+        </w:rPr>
+        <w:t>Post-disclosure observations are labeled as synthesis. They are not retrospectively attributed to either reviewer as part of that reviewer's frozen independent findings.</w:t>
+      </w:r>
+    </w:p>
+    <w:p>
+      <w:pPr>
+        <w:pStyle w:val="Heading1"/>
+        <w:keepNext/>
+      </w:pPr>
+      <w:r>
+        <w:t>3. Central V2 result</w:t>
+      </w:r>
+    </w:p>
+    <w:p>
+      <w:pPr>
+        <w:spacing w:before="0" w:after="100"/>
+      </w:pPr>
+      <w:r>
+        <w:rPr>
+          <w:b/>
+          <w:i w:val="0"/>
+          <w:color w:val="1F4E79"/>
+        </w:rPr>
+        <w:t>ADJUDICATION - SURVIVES WITHIN REPRESENTED AND TESTED SCOPE</w:t>
+      </w:r>
+    </w:p>
+    <w:p>
+      <w:pPr>
+        <w:spacing w:before="0" w:after="120"/>
+      </w:pPr>
+      <w:r>
+        <w:rPr>
+          <w:b w:val="0"/>
+          <w:i w:val="0"/>
+        </w:rPr>
+        <w:t>The combined independent evidence supports the central V2 result: an organizational authority decision can be translated into an enforceable boundary that causally controls execution. Claude's inside/outside and matched-pair results independently support the conclusion that the boundary is causal rather than decorative. Wojciech's independent attacks likewise did not identify a path in which a non-ACTIVE authority state created a new executable boundary.</w:t>
+      </w:r>
+    </w:p>
+    <w:p>
+      <w:pPr>
+        <w:spacing w:before="0" w:after="120"/>
+      </w:pPr>
+      <w:r>
+        <w:rPr>
+          <w:b w:val="0"/>
+          <w:i w:val="0"/>
+        </w:rPr>
+        <w:t>This result is bounded. It does not establish that the organization selected the correct authority boundary, that every causal explanation recorded by the implementation is faithful, or that authority remains valid across temporal or provenance conditions V2 does not independently represent.</w:t>
+      </w:r>
+    </w:p>
+    <w:p>
+      <w:pPr>
+        <w:pStyle w:val="Heading1"/>
+        <w:keepNext/>
+      </w:pPr>
+      <w:r>
+        <w:t>4. Direct convergence</w:t>
+      </w:r>
+    </w:p>
+    <w:p>
+      <w:pPr>
+        <w:pStyle w:val="Heading2"/>
+        <w:keepNext/>
+      </w:pPr>
+      <w:r>
+        <w:t>4.1 Enforceable boundary is causal, not decorative</w:t>
+      </w:r>
+    </w:p>
+    <w:p>
+      <w:pPr>
+        <w:spacing w:before="0" w:after="120"/>
+      </w:pPr>
+      <w:r>
+        <w:rPr>
+          <w:b w:val="0"/>
+          <w:i w:val="0"/>
+        </w:rPr>
+        <w:t>Both evidence streams support the proposition that execution changes when the enforceable authority boundary changes. This is the strongest direct convergence on V2's central experimental hypothesis.</w:t>
+      </w:r>
+    </w:p>
+    <w:p>
+      <w:pPr>
+        <w:pStyle w:val="Heading2"/>
+        <w:keepNext/>
+      </w:pPr>
+      <w:r>
+        <w:t>4.2 No demonstrated zero-authority execution bypass</w:t>
+      </w:r>
+    </w:p>
+    <w:p>
+      <w:pPr>
+        <w:spacing w:before="0" w:after="120"/>
+      </w:pPr>
+      <w:r>
+        <w:rPr>
+          <w:b w:val="0"/>
+          <w:i w:val="0"/>
+        </w:rPr>
+        <w:t>Across the reviewed ordinary paths, neither reviewer demonstrated an ALLOW produced from a zero-authority state. Wojciech independently found that non-ACTIVE authority cannot create a new executable boundary.</w:t>
+      </w:r>
+    </w:p>
+    <w:p>
+      <w:pPr>
+        <w:pStyle w:val="Heading2"/>
+        <w:keepNext/>
+      </w:pPr>
+      <w:r>
+        <w:t>4.3 Correct enforcement is not correct organizational specification</w:t>
+      </w:r>
+    </w:p>
+    <w:p>
+      <w:pPr>
+        <w:spacing w:before="0" w:after="120"/>
+      </w:pPr>
+      <w:r>
+        <w:rPr>
+          <w:b w:val="0"/>
+          <w:i w:val="0"/>
+        </w:rPr>
+        <w:t>Both reviews preserve the distinction between faithfully enforcing a represented boundary and proving that the organization chose the correct boundary in the first place. Procurement is the clearest evidence for this distinction.</w:t>
+      </w:r>
+    </w:p>
+    <w:p>
+      <w:pPr>
+        <w:pStyle w:val="Heading1"/>
+        <w:keepNext/>
+      </w:pPr>
+      <w:r>
+        <w:t>5. Claude F-1: safe outcome, wrong causal narrative</w:t>
+      </w:r>
+    </w:p>
+    <w:p>
+      <w:pPr>
+        <w:spacing w:before="0" w:after="100"/>
+      </w:pPr>
+      <w:r>
+        <w:rPr>
+          <w:b/>
+          <w:i w:val="0"/>
+          <w:color w:val="1F4E79"/>
+        </w:rPr>
+        <w:t>ADJUDICATION - PROBABLE IMPLEMENTATION / EVIDENCE-INTEGRITY DEFECT</w:t>
+      </w:r>
+    </w:p>
+    <w:p>
+      <w:pPr>
+        <w:spacing w:before="0" w:after="120"/>
+      </w:pPr>
+      <w:r>
+        <w:rPr>
+          <w:b w:val="0"/>
+          <w:i w:val="0"/>
+        </w:rPr>
+        <w:t>Claude found a Refund path in which an empty transfer-owner string produced a safe BLOCK while the materiality/authority narrative was inconsistent with the actual causal state. The observed safety outcome therefore does not erase the evidence-integrity problem.</w:t>
+      </w:r>
+    </w:p>
+    <w:p>
+      <w:pPr>
+        <w:spacing w:before="0" w:after="120"/>
+      </w:pPr>
+      <w:r>
+        <w:rPr>
+          <w:b w:val="0"/>
+          <w:i w:val="0"/>
+        </w:rPr>
+        <w:t>Wojciech's frozen finding that V2 preserves distinct BLOCK reasons remains intact. His post-disclosure analysis sharpens the interpretation: structural distinguishability of execution reasons does not by itself guarantee causal evidence fidelity.</w:t>
+      </w:r>
+    </w:p>
+    <w:p>
+      <w:pPr>
+        <w:pStyle w:val="Heading2"/>
+        <w:keepNext/>
+      </w:pPr>
+      <w:r>
+        <w:t>5.1 Layered interpretation</w:t>
       </w:r>
     </w:p>
     <w:tbl>
@@ -43,14 +523,88 @@
         <w:tblLook w:firstColumn="1" w:firstRow="1" w:lastColumn="0" w:lastRow="0" w:noHBand="0" w:noVBand="1" w:val="04A0"/>
       </w:tblPr>
       <w:tblGrid>
-        <w:gridCol w:w="2376"/>
-        <w:gridCol w:w="8208"/>
+        <w:gridCol w:w="3293"/>
+        <w:gridCol w:w="3293"/>
+        <w:gridCol w:w="3293"/>
       </w:tblGrid>
       <w:tr>
         <w:tc>
           <w:tcPr>
-            <w:tcW w:type="dxa" w:w="5083"/>
+            <w:tcW w:type="dxa" w:w="2952"/>
+            <w:vAlign w:val="center"/>
             <w:shd w:fill="D9EAF7"/>
+            <w:tcMar>
+              <w:top w:w="100" w:type="dxa"/>
+              <w:start w:w="120" w:type="dxa"/>
+              <w:bottom w:w="100" w:type="dxa"/>
+              <w:end w:w="120" w:type="dxa"/>
+            </w:tcMar>
+          </w:tcPr>
+          <w:p>
+            <w:pPr>
+              <w:jc w:val="center"/>
+            </w:pPr>
+            <w:r>
+              <w:rPr>
+                <w:b/>
+              </w:rPr>
+              <w:t>Issue</w:t>
+            </w:r>
+          </w:p>
+        </w:tc>
+        <w:tc>
+          <w:tcPr>
+            <w:tcW w:type="dxa" w:w="3024"/>
+            <w:vAlign w:val="center"/>
+            <w:shd w:fill="D9EAF7"/>
+            <w:tcMar>
+              <w:top w:w="100" w:type="dxa"/>
+              <w:start w:w="120" w:type="dxa"/>
+              <w:bottom w:w="100" w:type="dxa"/>
+              <w:end w:w="120" w:type="dxa"/>
+            </w:tcMar>
+          </w:tcPr>
+          <w:p>
+            <w:pPr>
+              <w:jc w:val="center"/>
+            </w:pPr>
+            <w:r>
+              <w:rPr>
+                <w:b/>
+              </w:rPr>
+              <w:t>Adjudication</w:t>
+            </w:r>
+          </w:p>
+        </w:tc>
+        <w:tc>
+          <w:tcPr>
+            <w:tcW w:type="dxa" w:w="4464"/>
+            <w:vAlign w:val="center"/>
+            <w:shd w:fill="D9EAF7"/>
+            <w:tcMar>
+              <w:top w:w="100" w:type="dxa"/>
+              <w:start w:w="120" w:type="dxa"/>
+              <w:bottom w:w="100" w:type="dxa"/>
+              <w:end w:w="120" w:type="dxa"/>
+            </w:tcMar>
+          </w:tcPr>
+          <w:p>
+            <w:pPr>
+              <w:jc w:val="center"/>
+            </w:pPr>
+            <w:r>
+              <w:rPr>
+                <w:b/>
+              </w:rPr>
+              <w:t>Claims boundary</w:t>
+            </w:r>
+          </w:p>
+        </w:tc>
+      </w:tr>
+      <w:tr>
+        <w:tc>
+          <w:tcPr>
+            <w:tcW w:type="dxa" w:w="2952"/>
             <w:vAlign w:val="center"/>
             <w:tcMar>
               <w:top w:w="100" w:type="dxa"/>
@@ -61,16 +615,16 @@
           </w:tcPr>
           <w:p>
             <w:pPr>
-              <w:spacing w:after="0"/>
+              <w:jc w:val="left"/>
             </w:pPr>
             <w:r>
-              <w:t>Record status</w:t>
+              <w:t>Execution outcome</w:t>
             </w:r>
           </w:p>
         </w:tc>
         <w:tc>
           <w:tcPr>
-            <w:tcW w:type="dxa" w:w="5083"/>
+            <w:tcW w:type="dxa" w:w="3024"/>
             <w:vAlign w:val="center"/>
             <w:tcMar>
               <w:top w:w="100" w:type="dxa"/>
@@ -81,19 +635,16 @@
           </w:tcPr>
           <w:p>
             <w:pPr>
-              <w:spacing w:after="0"/>
+              <w:jc w:val="center"/>
             </w:pPr>
             <w:r>
-              <w:t>CROSS-REVIEW ADJUDICATION - does not modify either reviewer's frozen evidence</w:t>
+              <w:t>Safe BLOCK</w:t>
             </w:r>
           </w:p>
         </w:tc>
-      </w:tr>
-      <w:tr>
         <w:tc>
           <w:tcPr>
-            <w:tcW w:type="dxa" w:w="5083"/>
-            <w:shd w:fill="D9EAF7"/>
+            <w:tcW w:type="dxa" w:w="4464"/>
             <w:vAlign w:val="center"/>
             <w:tcMar>
               <w:top w:w="100" w:type="dxa"/>
@@ -104,16 +655,18 @@
           </w:tcPr>
           <w:p>
             <w:pPr>
-              <w:spacing w:after="0"/>
+              <w:jc w:val="left"/>
             </w:pPr>
             <w:r>
-              <w:t>Target</w:t>
+              <w:t>No unauthorized ALLOW was demonstrated by F-1.</w:t>
             </w:r>
           </w:p>
         </w:tc>
+      </w:tr>
+      <w:tr>
         <w:tc>
           <w:tcPr>
-            <w:tcW w:type="dxa" w:w="5083"/>
+            <w:tcW w:type="dxa" w:w="2952"/>
             <w:vAlign w:val="center"/>
             <w:tcMar>
               <w:top w:w="100" w:type="dxa"/>
@@ -124,19 +677,16 @@
           </w:tcPr>
           <w:p>
             <w:pPr>
-              <w:spacing w:after="0"/>
+              <w:jc w:val="left"/>
             </w:pPr>
             <w:r>
-              <w:t>Frozen V2.0.0 artifact; no retrospective repair</w:t>
+              <w:t>Structural reason capacity</w:t>
             </w:r>
           </w:p>
         </w:tc>
-      </w:tr>
-      <w:tr>
         <w:tc>
           <w:tcPr>
-            <w:tcW w:type="dxa" w:w="5083"/>
-            <w:shd w:fill="D9EAF7"/>
+            <w:tcW w:type="dxa" w:w="3024"/>
             <w:vAlign w:val="center"/>
             <w:tcMar>
               <w:top w:w="100" w:type="dxa"/>
@@ -147,16 +697,16 @@
           </w:tcPr>
           <w:p>
             <w:pPr>
-              <w:spacing w:after="0"/>
+              <w:jc w:val="center"/>
             </w:pPr>
             <w:r>
-              <w:t>Claude basis</w:t>
+              <w:t>SURVIVES</w:t>
             </w:r>
           </w:p>
         </w:tc>
         <w:tc>
           <w:tcPr>
-            <w:tcW w:type="dxa" w:w="5083"/>
+            <w:tcW w:type="dxa" w:w="4464"/>
             <w:vAlign w:val="center"/>
             <w:tcMar>
               <w:top w:w="100" w:type="dxa"/>
@@ -167,10 +717,10 @@
           </w:tcPr>
           <w:p>
             <w:pPr>
-              <w:spacing w:after="0"/>
+              <w:jc w:val="left"/>
             </w:pPr>
             <w:r>
-              <w:t>Final public adversarial review: 109 browser cases; 103 PASS, 4 REVIEW REQUIRED, 2 FAIL-IMPLEMENTATION</w:t>
+              <w:t>V2 can preserve distinct reasons for BLOCK.</w:t>
             </w:r>
           </w:p>
         </w:tc>
@@ -178,8 +728,7 @@
       <w:tr>
         <w:tc>
           <w:tcPr>
-            <w:tcW w:type="dxa" w:w="5083"/>
-            <w:shd w:fill="D9EAF7"/>
+            <w:tcW w:type="dxa" w:w="2952"/>
             <w:vAlign w:val="center"/>
             <w:tcMar>
               <w:top w:w="100" w:type="dxa"/>
@@ -190,16 +739,16 @@
           </w:tcPr>
           <w:p>
             <w:pPr>
-              <w:spacing w:after="0"/>
+              <w:jc w:val="left"/>
             </w:pPr>
             <w:r>
-              <w:t>Wojciech basis</w:t>
+              <w:t>Causal evidence fidelity</w:t>
             </w:r>
           </w:p>
         </w:tc>
         <w:tc>
           <w:tcPr>
-            <w:tcW w:type="dxa" w:w="5083"/>
+            <w:tcW w:type="dxa" w:w="3024"/>
             <w:vAlign w:val="center"/>
             <w:tcMar>
               <w:top w:w="100" w:type="dxa"/>
@@ -210,19 +759,16 @@
           </w:tcPr>
           <w:p>
             <w:pPr>
-              <w:spacing w:after="0"/>
+              <w:jc w:val="center"/>
             </w:pPr>
             <w:r>
-              <w:t>Final independent V2 adversarial assessment, frozen before exposure to other reviewers</w:t>
+              <w:t>DEFECT INDICATED</w:t>
             </w:r>
           </w:p>
         </w:tc>
-      </w:tr>
-      <w:tr>
         <w:tc>
           <w:tcPr>
-            <w:tcW w:type="dxa" w:w="5083"/>
-            <w:shd w:fill="D9EAF7"/>
+            <w:tcW w:type="dxa" w:w="4464"/>
             <w:vAlign w:val="center"/>
             <w:tcMar>
               <w:top w:w="100" w:type="dxa"/>
@@ -233,16 +779,641 @@
           </w:tcPr>
           <w:p>
             <w:pPr>
-              <w:spacing w:after="0"/>
+              <w:jc w:val="left"/>
             </w:pPr>
             <w:r>
-              <w:t>Authority</w:t>
+              <w:t>A particular implementation path can misdescribe why the authority state arose.</w:t>
+            </w:r>
+          </w:p>
+        </w:tc>
+      </w:tr>
+    </w:tbl>
+    <w:p/>
+    <w:p>
+      <w:pPr>
+        <w:spacing w:before="0" w:after="120"/>
+      </w:pPr>
+      <w:r>
+        <w:rPr>
+          <w:b w:val="0"/>
+          <w:i w:val="0"/>
+        </w:rPr>
+        <w:t>These statements are compatible rather than contradictory. A system may reach a safe execution result, possess a structure capable of distinguishing reasons, and still emit an incorrect causal account for a particular state transition.</w:t>
+      </w:r>
+    </w:p>
+    <w:p>
+      <w:pPr>
+        <w:pStyle w:val="Heading1"/>
+        <w:keepNext/>
+      </w:pPr>
+      <w:r>
+        <w:t>6. Procurement F-2: unresolved governing semantics</w:t>
+      </w:r>
+    </w:p>
+    <w:p>
+      <w:pPr>
+        <w:spacing w:before="0" w:after="100"/>
+      </w:pPr>
+      <w:r>
+        <w:rPr>
+          <w:b/>
+          <w:i w:val="0"/>
+          <w:color w:val="1F4E79"/>
+        </w:rPr>
+        <w:t>ADJUDICATION - SPECIFICATION / EXPERIMENTAL-SEMANTICS QUESTION; UNRESOLVED</w:t>
+      </w:r>
+    </w:p>
+    <w:p>
+      <w:pPr>
+        <w:spacing w:before="0" w:after="120"/>
+      </w:pPr>
+      <w:r>
+        <w:rPr>
+          <w:b w:val="0"/>
+          <w:i w:val="0"/>
+        </w:rPr>
+        <w:t>Claude observed that RENEW followed the selected governed metric while NARROW remained attached to equipmentPriceCents. The observation is real, but the available governing evidence does not resolve whether NARROW should follow the newly selected current metric or intentionally remain attached to the prior authority basis while RENEW changes the governed basis.</w:t>
+      </w:r>
+    </w:p>
+    <w:p>
+      <w:pPr>
+        <w:spacing w:before="0" w:after="120"/>
+      </w:pPr>
+      <w:r>
+        <w:rPr>
+          <w:b w:val="0"/>
+          <w:i w:val="0"/>
+        </w:rPr>
+        <w:t>Wojciech independently reached the same post-disclosure classification: F-2 should not yet be accepted as a confirmed implementation defect. The correct disposition is unresolved pending governing-specification adjudication.</w:t>
+      </w:r>
+    </w:p>
+    <w:p>
+      <w:pPr>
+        <w:spacing w:before="0" w:after="120"/>
+      </w:pPr>
+      <w:r>
+        <w:rPr>
+          <w:b w:val="0"/>
+          <w:i w:val="0"/>
+        </w:rPr>
+        <w:t>Accordingly, this document does not classify F-2 as PASS, implementation defect, or legitimate intended behavior. The oracle itself is unresolved.</w:t>
+      </w:r>
+    </w:p>
+    <w:p>
+      <w:pPr>
+        <w:pStyle w:val="Heading1"/>
+        <w:keepNext/>
+      </w:pPr>
+      <w:r>
+        <w:t>7. ACCESS anomaly and temporal continuity are adjacent, not identical</w:t>
+      </w:r>
+    </w:p>
+    <w:p>
+      <w:pPr>
+        <w:pStyle w:val="Heading2"/>
+        <w:keepNext/>
+      </w:pPr>
+      <w:r>
+        <w:t>7.1 Claude ACCESS observation</w:t>
+      </w:r>
+    </w:p>
+    <w:p>
+      <w:pPr>
+        <w:spacing w:before="0" w:after="120"/>
+      </w:pPr>
+      <w:r>
+        <w:rPr>
+          <w:b w:val="0"/>
+          <w:i w:val="0"/>
+        </w:rPr>
+        <w:t>Claude reported a possible state/history propagation anomaly that was not cleanly reproduced. It remains REVIEW REQUIRED rather than a confirmed implementation defect.</w:t>
+      </w:r>
+    </w:p>
+    <w:p>
+      <w:pPr>
+        <w:pStyle w:val="Heading2"/>
+        <w:keepNext/>
+      </w:pPr>
+      <w:r>
+        <w:t>7.2 Wojciech temporal-continuity finding</w:t>
+      </w:r>
+    </w:p>
+    <w:p>
+      <w:pPr>
+        <w:spacing w:before="0" w:after="120"/>
+      </w:pPr>
+      <w:r>
+        <w:rPr>
+          <w:b w:val="0"/>
+          <w:i w:val="0"/>
+        </w:rPr>
+        <w:t>Wojciech's finding is architectural: V2 does not represent the t0 -&gt; t1 -&gt; t2 transition in which valid authority creates a boundary, the source authority later becomes stale, and that previously created boundary is then presented for execution.</w:t>
+      </w:r>
+    </w:p>
+    <w:p>
+      <w:pPr>
+        <w:spacing w:before="0" w:after="120"/>
+      </w:pPr>
+      <w:r>
+        <w:rPr>
+          <w:b w:val="0"/>
+          <w:i w:val="0"/>
+        </w:rPr>
+        <w:t>Wojciech explicitly kept Claude's ACCESS observation separate after disclosure. The two findings are adjacent because both involve state over time, but they are not the same evidence and should not be collapsed.</w:t>
+      </w:r>
+    </w:p>
+    <w:p>
+      <w:pPr>
+        <w:pStyle w:val="Heading1"/>
+        <w:keepNext/>
+      </w:pPr>
+      <w:r>
+        <w:t>8. Wojciech-only representation boundaries and research limits</w:t>
+      </w:r>
+    </w:p>
+    <w:p>
+      <w:pPr>
+        <w:spacing w:after="100"/>
+      </w:pPr>
+      <w:r>
+        <w:rPr>
+          <w:b/>
+        </w:rPr>
+        <w:t xml:space="preserve">Temporal continuity/currentness: </w:t>
+      </w:r>
+      <w:r>
+        <w:t>V2 preserves authority validity at boundary creation but does not independently represent continuing source-authority validity through a later state transition.</w:t>
+      </w:r>
+    </w:p>
+    <w:p>
+      <w:pPr>
+        <w:spacing w:after="100"/>
+      </w:pPr>
+      <w:r>
+        <w:rPr>
+          <w:b/>
+        </w:rPr>
+        <w:t xml:space="preserve">Governing provenance: </w:t>
+      </w:r>
+      <w:r>
+        <w:t>Authority lineage is recorded and auditable, but after boundary creation it is not independently consumed as an execution predicate. This is an execution-layer discrimination limit, not evidence that the normal governed V2 pipeline can manufacture illegitimate lineage.</w:t>
+      </w:r>
+    </w:p>
+    <w:p>
+      <w:pPr>
+        <w:spacing w:after="100"/>
+      </w:pPr>
+      <w:r>
+        <w:rPr>
+          <w:b/>
+        </w:rPr>
+        <w:t xml:space="preserve">Replay: </w:t>
+      </w:r>
+      <w:r>
+        <w:t>Governed replay can reconstruct the authority/boundary chain, while the boundary artifact itself is not independently bound to the originating run or authority epoch.</w:t>
+      </w:r>
+    </w:p>
+    <w:p>
+      <w:pPr>
+        <w:spacing w:after="100"/>
+      </w:pPr>
+      <w:r>
+        <w:rPr>
+          <w:b/>
+        </w:rPr>
+        <w:t xml:space="preserve">Policy/scenario drift: </w:t>
+      </w:r>
+      <w:r>
+        <w:t>Not an independent finding; it is subsumed by the governing-provenance issue.</w:t>
+      </w:r>
+    </w:p>
+    <w:p>
+      <w:pPr>
+        <w:spacing w:after="100"/>
+      </w:pPr>
+      <w:r>
+        <w:rPr>
+          <w:b/>
+        </w:rPr>
+        <w:t xml:space="preserve">Semantic decision-object identity: </w:t>
+      </w:r>
+      <w:r>
+        <w:t>V2 cannot independently discriminate materially different authorized decision objects when their executable fields produce the same executable shape but their governed consequences are semantically different.</w:t>
+      </w:r>
+    </w:p>
+    <w:p>
+      <w:pPr>
+        <w:spacing w:after="100"/>
+      </w:pPr>
+      <w:r>
+        <w:rPr>
+          <w:b/>
+        </w:rPr>
+        <w:t xml:space="preserve">Correct organizational authority: </w:t>
+      </w:r>
+      <w:r>
+        <w:t>Correct enforcement does not establish that the organization specified the correct authority boundary.</w:t>
+      </w:r>
+    </w:p>
+    <w:p>
+      <w:pPr>
+        <w:pStyle w:val="Heading1"/>
+        <w:keepNext/>
+      </w:pPr>
+      <w:r>
+        <w:t>9. Parked upstream questions</w:t>
+      </w:r>
+    </w:p>
+    <w:p>
+      <w:pPr>
+        <w:spacing w:before="0" w:after="120"/>
+      </w:pPr>
+      <w:r>
+        <w:rPr>
+          <w:b w:val="0"/>
+          <w:i w:val="0"/>
+        </w:rPr>
+        <w:t>The following questions remain deliberately outside the frozen V2 findings and must not be retroactively presented as conclusions of either independent review:</w:t>
+      </w:r>
+    </w:p>
+    <w:p>
+      <w:pPr>
+        <w:pStyle w:val="ListBullet"/>
+        <w:spacing w:after="60"/>
+      </w:pPr>
+      <w:r>
+        <w:t>Whether the actor creating or changing authority had standing to do so.</w:t>
+      </w:r>
+    </w:p>
+    <w:p>
+      <w:pPr>
+        <w:pStyle w:val="ListBullet"/>
+        <w:spacing w:after="60"/>
+      </w:pPr>
+      <w:r>
+        <w:t>The broader authority-to-authorize problem.</w:t>
+      </w:r>
+    </w:p>
+    <w:p>
+      <w:pPr>
+        <w:pStyle w:val="ListBullet"/>
+        <w:spacing w:after="60"/>
+      </w:pPr>
+      <w:r>
+        <w:t>Recursion and termination of authority lineage.</w:t>
+      </w:r>
+    </w:p>
+    <w:p>
+      <w:pPr>
+        <w:pStyle w:val="ListBullet"/>
+        <w:spacing w:after="60"/>
+      </w:pPr>
+      <w:r>
+        <w:t>The candidate trust anchor for legitimate authority creation.</w:t>
+      </w:r>
+    </w:p>
+    <w:p>
+      <w:pPr>
+        <w:pStyle w:val="ListBullet"/>
+        <w:spacing w:after="60"/>
+      </w:pPr>
+      <w:r>
+        <w:t>Institutional or office continuity when authority-bearing actors or offices change.</w:t>
+      </w:r>
+    </w:p>
+    <w:p>
+      <w:pPr>
+        <w:spacing w:before="0" w:after="120"/>
+      </w:pPr>
+      <w:r>
+        <w:rPr>
+          <w:b w:val="0"/>
+          <w:i w:val="0"/>
+        </w:rPr>
+        <w:t>These are research questions for later work unless separately authorized. No V2 repair or V3 interpretation is authorized by this adjudication.</w:t>
+      </w:r>
+    </w:p>
+    <w:p>
+      <w:pPr>
+        <w:pStyle w:val="Heading1"/>
+        <w:keepNext/>
+      </w:pPr>
+      <w:r>
+        <w:t>10. Post-disclosure synthesis: causal and evidentiary fidelity</w:t>
+      </w:r>
+    </w:p>
+    <w:p>
+      <w:pPr>
+        <w:spacing w:before="0" w:after="100"/>
+      </w:pPr>
+      <w:r>
+        <w:rPr>
+          <w:b/>
+          <w:i w:val="0"/>
+          <w:color w:val="1F4E79"/>
+        </w:rPr>
+        <w:t>POST-DISCLOSURE SYNTHESIS QUESTION - NOT A V2 FINDING AND NOT A REPAIR PROPOSAL</w:t>
+      </w:r>
+    </w:p>
+    <w:p>
+      <w:pPr>
+        <w:spacing w:before="0" w:after="120"/>
+      </w:pPr>
+      <w:r>
+        <w:rPr>
+          <w:b w:val="0"/>
+          <w:i w:val="0"/>
+        </w:rPr>
+        <w:t>After reading Claude's review as a separate evidence stream, Wojciech identified a broader question that neither independent review establishes alone:</w:t>
+      </w:r>
+    </w:p>
+    <w:p>
+      <w:pPr>
+        <w:spacing w:before="80" w:after="200"/>
+        <w:ind w:left="504" w:right="504"/>
+      </w:pPr>
+      <w:r>
+        <w:rPr>
+          <w:b/>
+          <w:i/>
+        </w:rPr>
+        <w:t>What has to remain aligned for an executable authority boundary to remain a causally and evidentially faithful representation of the authority state it claims to carry?</w:t>
+      </w:r>
+    </w:p>
+    <w:p>
+      <w:pPr>
+        <w:spacing w:before="0" w:after="120"/>
+      </w:pPr>
+      <w:r>
+        <w:rPr>
+          <w:b w:val="0"/>
+          <w:i w:val="0"/>
+        </w:rPr>
+        <w:t>The combined evidence exposes a possible fidelity problem across four related but non-identical layers:</w:t>
+      </w:r>
+    </w:p>
+    <w:tbl>
+      <w:tblPr>
+        <w:tblW w:type="auto" w:w="0"/>
+        <w:jc w:val="center"/>
+        <w:tblLayout w:type="fixed"/>
+        <w:tblLook w:firstColumn="1" w:firstRow="1" w:lastColumn="0" w:lastRow="0" w:noHBand="0" w:noVBand="1" w:val="04A0"/>
+      </w:tblPr>
+      <w:tblGrid>
+        <w:gridCol w:w="2469"/>
+        <w:gridCol w:w="2469"/>
+        <w:gridCol w:w="2469"/>
+        <w:gridCol w:w="2469"/>
+      </w:tblGrid>
+      <w:tr>
+        <w:tc>
+          <w:tcPr>
+            <w:tcW w:type="dxa" w:w="2563"/>
+            <w:vAlign w:val="center"/>
+            <w:shd w:fill="EAF2F8"/>
+            <w:tcMar>
+              <w:top w:w="140" w:type="dxa"/>
+              <w:start w:w="120" w:type="dxa"/>
+              <w:bottom w:w="140" w:type="dxa"/>
+              <w:end w:w="120" w:type="dxa"/>
+            </w:tcMar>
+          </w:tcPr>
+          <w:p>
+            <w:pPr>
+              <w:jc w:val="center"/>
+            </w:pPr>
+            <w:r>
+              <w:rPr>
+                <w:b/>
+              </w:rPr>
+              <w:t>Organizational</w:t>
+              <w:br/>
+              <w:t>authority</w:t>
             </w:r>
           </w:p>
         </w:tc>
         <w:tc>
           <w:tcPr>
-            <w:tcW w:type="dxa" w:w="5083"/>
+            <w:tcW w:type="dxa" w:w="2563"/>
+            <w:vAlign w:val="center"/>
+            <w:shd w:fill="EAF2F8"/>
+            <w:tcMar>
+              <w:top w:w="140" w:type="dxa"/>
+              <w:start w:w="120" w:type="dxa"/>
+              <w:bottom w:w="140" w:type="dxa"/>
+              <w:end w:w="120" w:type="dxa"/>
+            </w:tcMar>
+          </w:tcPr>
+          <w:p>
+            <w:pPr>
+              <w:jc w:val="center"/>
+            </w:pPr>
+            <w:r>
+              <w:rPr>
+                <w:b/>
+              </w:rPr>
+              <w:t>Represented</w:t>
+              <w:br/>
+              <w:t>authority</w:t>
+            </w:r>
+          </w:p>
+        </w:tc>
+        <w:tc>
+          <w:tcPr>
+            <w:tcW w:type="dxa" w:w="2563"/>
+            <w:vAlign w:val="center"/>
+            <w:shd w:fill="EAF2F8"/>
+            <w:tcMar>
+              <w:top w:w="140" w:type="dxa"/>
+              <w:start w:w="120" w:type="dxa"/>
+              <w:bottom w:w="140" w:type="dxa"/>
+              <w:end w:w="120" w:type="dxa"/>
+            </w:tcMar>
+          </w:tcPr>
+          <w:p>
+            <w:pPr>
+              <w:jc w:val="center"/>
+            </w:pPr>
+            <w:r>
+              <w:rPr>
+                <w:b/>
+              </w:rPr>
+              <w:t>Executable</w:t>
+              <w:br/>
+              <w:t>boundary</w:t>
+            </w:r>
+          </w:p>
+        </w:tc>
+        <w:tc>
+          <w:tcPr>
+            <w:tcW w:type="dxa" w:w="2563"/>
+            <w:vAlign w:val="center"/>
+            <w:shd w:fill="EAF2F8"/>
+            <w:tcMar>
+              <w:top w:w="140" w:type="dxa"/>
+              <w:start w:w="120" w:type="dxa"/>
+              <w:bottom w:w="140" w:type="dxa"/>
+              <w:end w:w="120" w:type="dxa"/>
+            </w:tcMar>
+          </w:tcPr>
+          <w:p>
+            <w:pPr>
+              <w:jc w:val="center"/>
+            </w:pPr>
+            <w:r>
+              <w:rPr>
+                <w:b/>
+              </w:rPr>
+              <w:t>Recorded causal</w:t>
+              <w:br/>
+              <w:t>explanation</w:t>
+            </w:r>
+          </w:p>
+        </w:tc>
+      </w:tr>
+    </w:tbl>
+    <w:p>
+      <w:pPr>
+        <w:spacing w:before="0" w:after="120"/>
+      </w:pPr>
+      <w:r>
+        <w:rPr>
+          <w:b w:val="0"/>
+          <w:i w:val="0"/>
+        </w:rPr>
+      </w:r>
+    </w:p>
+    <w:p>
+      <w:pPr>
+        <w:spacing w:before="0" w:after="120"/>
+      </w:pPr>
+      <w:r>
+        <w:rPr>
+          <w:b w:val="0"/>
+          <w:i w:val="0"/>
+        </w:rPr>
+        <w:t>Claude shows that the recorded explanation can be wrong even when the final BLOCK is safe. Wojciech shows that lineage can be preserved but non-governing at execution, and that continuing authority validity after boundary creation is not represented. Together, those findings support asking what alignment conditions are necessary for an executable artifact to remain both causally operative and evidentially faithful.</w:t>
+      </w:r>
+    </w:p>
+    <w:p>
+      <w:pPr>
+        <w:spacing w:before="0" w:after="120"/>
+      </w:pPr>
+      <w:r>
+        <w:rPr>
+          <w:b w:val="0"/>
+          <w:i w:val="0"/>
+        </w:rPr>
+        <w:t>The combined review does not answer that question. It is preserved here as a post-disclosure synthesis question only.</w:t>
+      </w:r>
+    </w:p>
+    <w:p>
+      <w:pPr>
+        <w:pStyle w:val="Heading1"/>
+        <w:keepNext/>
+        <w:pageBreakBefore/>
+      </w:pPr>
+      <w:r>
+        <w:t>11. Final issue adjudication</w:t>
+      </w:r>
+    </w:p>
+    <w:tbl>
+      <w:tblPr>
+        <w:tblW w:type="auto" w:w="0"/>
+        <w:jc w:val="center"/>
+        <w:tblLayout w:type="fixed"/>
+        <w:tblLook w:firstColumn="1" w:firstRow="1" w:lastColumn="0" w:lastRow="0" w:noHBand="0" w:noVBand="1" w:val="04A0"/>
+      </w:tblPr>
+      <w:tblGrid>
+        <w:gridCol w:w="3293"/>
+        <w:gridCol w:w="3293"/>
+        <w:gridCol w:w="3293"/>
+      </w:tblGrid>
+      <w:tr>
+        <w:trPr>
+          <w:tblHeader w:val="true"/>
+          <w:cantSplit/>
+        </w:trPr>
+        <w:tc>
+          <w:tcPr>
+            <w:tcW w:type="dxa" w:w="2952"/>
+            <w:vAlign w:val="center"/>
+            <w:shd w:fill="D9EAF7"/>
+            <w:tcMar>
+              <w:top w:w="100" w:type="dxa"/>
+              <w:start w:w="120" w:type="dxa"/>
+              <w:bottom w:w="100" w:type="dxa"/>
+              <w:end w:w="120" w:type="dxa"/>
+            </w:tcMar>
+          </w:tcPr>
+          <w:p>
+            <w:pPr>
+              <w:jc w:val="center"/>
+            </w:pPr>
+            <w:r>
+              <w:rPr>
+                <w:b/>
+              </w:rPr>
+              <w:t>Issue</w:t>
+            </w:r>
+          </w:p>
+        </w:tc>
+        <w:tc>
+          <w:tcPr>
+            <w:tcW w:type="dxa" w:w="3024"/>
+            <w:vAlign w:val="center"/>
+            <w:shd w:fill="D9EAF7"/>
+            <w:tcMar>
+              <w:top w:w="100" w:type="dxa"/>
+              <w:start w:w="120" w:type="dxa"/>
+              <w:bottom w:w="100" w:type="dxa"/>
+              <w:end w:w="120" w:type="dxa"/>
+            </w:tcMar>
+          </w:tcPr>
+          <w:p>
+            <w:pPr>
+              <w:jc w:val="center"/>
+            </w:pPr>
+            <w:r>
+              <w:rPr>
+                <w:b/>
+              </w:rPr>
+              <w:t>Adjudication</w:t>
+            </w:r>
+          </w:p>
+        </w:tc>
+        <w:tc>
+          <w:tcPr>
+            <w:tcW w:type="dxa" w:w="4464"/>
+            <w:vAlign w:val="center"/>
+            <w:shd w:fill="D9EAF7"/>
+            <w:tcMar>
+              <w:top w:w="100" w:type="dxa"/>
+              <w:start w:w="120" w:type="dxa"/>
+              <w:bottom w:w="100" w:type="dxa"/>
+              <w:end w:w="120" w:type="dxa"/>
+            </w:tcMar>
+          </w:tcPr>
+          <w:p>
+            <w:pPr>
+              <w:jc w:val="center"/>
+            </w:pPr>
+            <w:r>
+              <w:rPr>
+                <w:b/>
+              </w:rPr>
+              <w:t>Claims boundary</w:t>
+            </w:r>
+          </w:p>
+        </w:tc>
+      </w:tr>
+      <w:tr>
+        <w:trPr>
+          <w:cantSplit/>
+        </w:trPr>
+        <w:tc>
+          <w:tcPr>
+            <w:tcW w:type="dxa" w:w="2952"/>
             <w:vAlign w:val="center"/>
             <w:tcMar>
               <w:top w:w="100" w:type="dxa"/>
@@ -253,10 +1424,635 @@
           </w:tcPr>
           <w:p>
             <w:pPr>
-              <w:spacing w:after="0"/>
+              <w:jc w:val="left"/>
             </w:pPr>
             <w:r>
-              <w:t>This document does not authorize implementation or conceptual-model changes</w:t>
+              <w:t>Central V2 causal-boundary hypothesis</w:t>
+            </w:r>
+          </w:p>
+        </w:tc>
+        <w:tc>
+          <w:tcPr>
+            <w:tcW w:type="dxa" w:w="3024"/>
+            <w:vAlign w:val="center"/>
+            <w:tcMar>
+              <w:top w:w="100" w:type="dxa"/>
+              <w:start w:w="120" w:type="dxa"/>
+              <w:bottom w:w="100" w:type="dxa"/>
+              <w:end w:w="120" w:type="dxa"/>
+            </w:tcMar>
+          </w:tcPr>
+          <w:p>
+            <w:pPr>
+              <w:jc w:val="center"/>
+            </w:pPr>
+            <w:r>
+              <w:t>SURVIVES</w:t>
+            </w:r>
+          </w:p>
+        </w:tc>
+        <w:tc>
+          <w:tcPr>
+            <w:tcW w:type="dxa" w:w="4464"/>
+            <w:vAlign w:val="center"/>
+            <w:tcMar>
+              <w:top w:w="100" w:type="dxa"/>
+              <w:start w:w="120" w:type="dxa"/>
+              <w:bottom w:w="100" w:type="dxa"/>
+              <w:end w:w="120" w:type="dxa"/>
+            </w:tcMar>
+          </w:tcPr>
+          <w:p>
+            <w:pPr>
+              <w:jc w:val="left"/>
+            </w:pPr>
+            <w:r>
+              <w:t>Within represented and tested scope.</w:t>
+            </w:r>
+          </w:p>
+        </w:tc>
+      </w:tr>
+      <w:tr>
+        <w:trPr>
+          <w:cantSplit/>
+        </w:trPr>
+        <w:tc>
+          <w:tcPr>
+            <w:tcW w:type="dxa" w:w="2952"/>
+            <w:vAlign w:val="center"/>
+            <w:tcMar>
+              <w:top w:w="100" w:type="dxa"/>
+              <w:start w:w="120" w:type="dxa"/>
+              <w:bottom w:w="100" w:type="dxa"/>
+              <w:end w:w="120" w:type="dxa"/>
+            </w:tcMar>
+          </w:tcPr>
+          <w:p>
+            <w:pPr>
+              <w:jc w:val="left"/>
+            </w:pPr>
+            <w:r>
+              <w:t>Claude F-1</w:t>
+            </w:r>
+          </w:p>
+        </w:tc>
+        <w:tc>
+          <w:tcPr>
+            <w:tcW w:type="dxa" w:w="3024"/>
+            <w:vAlign w:val="center"/>
+            <w:tcMar>
+              <w:top w:w="100" w:type="dxa"/>
+              <w:start w:w="120" w:type="dxa"/>
+              <w:bottom w:w="100" w:type="dxa"/>
+              <w:end w:w="120" w:type="dxa"/>
+            </w:tcMar>
+          </w:tcPr>
+          <w:p>
+            <w:pPr>
+              <w:jc w:val="center"/>
+            </w:pPr>
+            <w:r>
+              <w:t>PROBABLE DEFECT</w:t>
+            </w:r>
+          </w:p>
+        </w:tc>
+        <w:tc>
+          <w:tcPr>
+            <w:tcW w:type="dxa" w:w="4464"/>
+            <w:vAlign w:val="center"/>
+            <w:tcMar>
+              <w:top w:w="100" w:type="dxa"/>
+              <w:start w:w="120" w:type="dxa"/>
+              <w:bottom w:w="100" w:type="dxa"/>
+              <w:end w:w="120" w:type="dxa"/>
+            </w:tcMar>
+          </w:tcPr>
+          <w:p>
+            <w:pPr>
+              <w:jc w:val="left"/>
+            </w:pPr>
+            <w:r>
+              <w:t>Implementation / evidence-integrity; safe BLOCK does not cure wrong causal narrative.</w:t>
+            </w:r>
+          </w:p>
+        </w:tc>
+      </w:tr>
+      <w:tr>
+        <w:trPr>
+          <w:cantSplit/>
+        </w:trPr>
+        <w:tc>
+          <w:tcPr>
+            <w:tcW w:type="dxa" w:w="2952"/>
+            <w:vAlign w:val="center"/>
+            <w:tcMar>
+              <w:top w:w="100" w:type="dxa"/>
+              <w:start w:w="120" w:type="dxa"/>
+              <w:bottom w:w="100" w:type="dxa"/>
+              <w:end w:w="120" w:type="dxa"/>
+            </w:tcMar>
+          </w:tcPr>
+          <w:p>
+            <w:pPr>
+              <w:jc w:val="left"/>
+            </w:pPr>
+            <w:r>
+              <w:t>Claude F-2</w:t>
+            </w:r>
+          </w:p>
+        </w:tc>
+        <w:tc>
+          <w:tcPr>
+            <w:tcW w:type="dxa" w:w="3024"/>
+            <w:vAlign w:val="center"/>
+            <w:tcMar>
+              <w:top w:w="100" w:type="dxa"/>
+              <w:start w:w="120" w:type="dxa"/>
+              <w:bottom w:w="100" w:type="dxa"/>
+              <w:end w:w="120" w:type="dxa"/>
+            </w:tcMar>
+          </w:tcPr>
+          <w:p>
+            <w:pPr>
+              <w:jc w:val="center"/>
+            </w:pPr>
+            <w:r>
+              <w:t>UNRESOLVED</w:t>
+            </w:r>
+          </w:p>
+        </w:tc>
+        <w:tc>
+          <w:tcPr>
+            <w:tcW w:type="dxa" w:w="4464"/>
+            <w:vAlign w:val="center"/>
+            <w:tcMar>
+              <w:top w:w="100" w:type="dxa"/>
+              <w:start w:w="120" w:type="dxa"/>
+              <w:bottom w:w="100" w:type="dxa"/>
+              <w:end w:w="120" w:type="dxa"/>
+            </w:tcMar>
+          </w:tcPr>
+          <w:p>
+            <w:pPr>
+              <w:jc w:val="left"/>
+            </w:pPr>
+            <w:r>
+              <w:t>Specification / experimental-semantics adjudication required.</w:t>
+            </w:r>
+          </w:p>
+        </w:tc>
+      </w:tr>
+      <w:tr>
+        <w:trPr>
+          <w:cantSplit/>
+        </w:trPr>
+        <w:tc>
+          <w:tcPr>
+            <w:tcW w:type="dxa" w:w="2952"/>
+            <w:vAlign w:val="center"/>
+            <w:tcMar>
+              <w:top w:w="100" w:type="dxa"/>
+              <w:start w:w="120" w:type="dxa"/>
+              <w:bottom w:w="100" w:type="dxa"/>
+              <w:end w:w="120" w:type="dxa"/>
+            </w:tcMar>
+          </w:tcPr>
+          <w:p>
+            <w:pPr>
+              <w:jc w:val="left"/>
+            </w:pPr>
+            <w:r>
+              <w:t>Claude ACCESS anomaly</w:t>
+            </w:r>
+          </w:p>
+        </w:tc>
+        <w:tc>
+          <w:tcPr>
+            <w:tcW w:type="dxa" w:w="3024"/>
+            <w:vAlign w:val="center"/>
+            <w:tcMar>
+              <w:top w:w="100" w:type="dxa"/>
+              <w:start w:w="120" w:type="dxa"/>
+              <w:bottom w:w="100" w:type="dxa"/>
+              <w:end w:w="120" w:type="dxa"/>
+            </w:tcMar>
+          </w:tcPr>
+          <w:p>
+            <w:pPr>
+              <w:jc w:val="center"/>
+            </w:pPr>
+            <w:r>
+              <w:t>REVIEW REQUIRED</w:t>
+            </w:r>
+          </w:p>
+        </w:tc>
+        <w:tc>
+          <w:tcPr>
+            <w:tcW w:type="dxa" w:w="4464"/>
+            <w:vAlign w:val="center"/>
+            <w:tcMar>
+              <w:top w:w="100" w:type="dxa"/>
+              <w:start w:w="120" w:type="dxa"/>
+              <w:bottom w:w="100" w:type="dxa"/>
+              <w:end w:w="120" w:type="dxa"/>
+            </w:tcMar>
+          </w:tcPr>
+          <w:p>
+            <w:pPr>
+              <w:jc w:val="left"/>
+            </w:pPr>
+            <w:r>
+              <w:t>Possible state/history propagation issue; not cleanly reproduced.</w:t>
+            </w:r>
+          </w:p>
+        </w:tc>
+      </w:tr>
+      <w:tr>
+        <w:trPr>
+          <w:cantSplit/>
+        </w:trPr>
+        <w:tc>
+          <w:tcPr>
+            <w:tcW w:type="dxa" w:w="2952"/>
+            <w:vAlign w:val="center"/>
+            <w:tcMar>
+              <w:top w:w="100" w:type="dxa"/>
+              <w:start w:w="120" w:type="dxa"/>
+              <w:bottom w:w="100" w:type="dxa"/>
+              <w:end w:w="120" w:type="dxa"/>
+            </w:tcMar>
+          </w:tcPr>
+          <w:p>
+            <w:pPr>
+              <w:jc w:val="left"/>
+            </w:pPr>
+            <w:r>
+              <w:t>Temporal continuity</w:t>
+            </w:r>
+          </w:p>
+        </w:tc>
+        <w:tc>
+          <w:tcPr>
+            <w:tcW w:type="dxa" w:w="3024"/>
+            <w:vAlign w:val="center"/>
+            <w:tcMar>
+              <w:top w:w="100" w:type="dxa"/>
+              <w:start w:w="120" w:type="dxa"/>
+              <w:bottom w:w="100" w:type="dxa"/>
+              <w:end w:w="120" w:type="dxa"/>
+            </w:tcMar>
+          </w:tcPr>
+          <w:p>
+            <w:pPr>
+              <w:jc w:val="center"/>
+            </w:pPr>
+            <w:r>
+              <w:t>CANNOT DISCRIMINATE</w:t>
+            </w:r>
+          </w:p>
+        </w:tc>
+        <w:tc>
+          <w:tcPr>
+            <w:tcW w:type="dxa" w:w="4464"/>
+            <w:vAlign w:val="center"/>
+            <w:tcMar>
+              <w:top w:w="100" w:type="dxa"/>
+              <w:start w:w="120" w:type="dxa"/>
+              <w:bottom w:w="100" w:type="dxa"/>
+              <w:end w:w="120" w:type="dxa"/>
+            </w:tcMar>
+          </w:tcPr>
+          <w:p>
+            <w:pPr>
+              <w:jc w:val="left"/>
+            </w:pPr>
+            <w:r>
+              <w:t>V2 representation limit after boundary creation.</w:t>
+            </w:r>
+          </w:p>
+        </w:tc>
+      </w:tr>
+      <w:tr>
+        <w:trPr>
+          <w:cantSplit/>
+        </w:trPr>
+        <w:tc>
+          <w:tcPr>
+            <w:tcW w:type="dxa" w:w="2952"/>
+            <w:vAlign w:val="center"/>
+            <w:tcMar>
+              <w:top w:w="100" w:type="dxa"/>
+              <w:start w:w="120" w:type="dxa"/>
+              <w:bottom w:w="100" w:type="dxa"/>
+              <w:end w:w="120" w:type="dxa"/>
+            </w:tcMar>
+          </w:tcPr>
+          <w:p>
+            <w:pPr>
+              <w:jc w:val="left"/>
+            </w:pPr>
+            <w:r>
+              <w:t>Governing provenance</w:t>
+            </w:r>
+          </w:p>
+        </w:tc>
+        <w:tc>
+          <w:tcPr>
+            <w:tcW w:type="dxa" w:w="3024"/>
+            <w:vAlign w:val="center"/>
+            <w:tcMar>
+              <w:top w:w="100" w:type="dxa"/>
+              <w:start w:w="120" w:type="dxa"/>
+              <w:bottom w:w="100" w:type="dxa"/>
+              <w:end w:w="120" w:type="dxa"/>
+            </w:tcMar>
+          </w:tcPr>
+          <w:p>
+            <w:pPr>
+              <w:jc w:val="center"/>
+            </w:pPr>
+            <w:r>
+              <w:t>CANNOT DISCRIMINATE</w:t>
+            </w:r>
+          </w:p>
+        </w:tc>
+        <w:tc>
+          <w:tcPr>
+            <w:tcW w:type="dxa" w:w="4464"/>
+            <w:vAlign w:val="center"/>
+            <w:tcMar>
+              <w:top w:w="100" w:type="dxa"/>
+              <w:start w:w="120" w:type="dxa"/>
+              <w:bottom w:w="100" w:type="dxa"/>
+              <w:end w:w="120" w:type="dxa"/>
+            </w:tcMar>
+          </w:tcPr>
+          <w:p>
+            <w:pPr>
+              <w:jc w:val="left"/>
+            </w:pPr>
+            <w:r>
+              <w:t>Recorded lineage is not independently governing at execution.</w:t>
+            </w:r>
+          </w:p>
+        </w:tc>
+      </w:tr>
+      <w:tr>
+        <w:trPr>
+          <w:cantSplit/>
+        </w:trPr>
+        <w:tc>
+          <w:tcPr>
+            <w:tcW w:type="dxa" w:w="2952"/>
+            <w:vAlign w:val="center"/>
+            <w:tcMar>
+              <w:top w:w="100" w:type="dxa"/>
+              <w:start w:w="120" w:type="dxa"/>
+              <w:bottom w:w="100" w:type="dxa"/>
+              <w:end w:w="120" w:type="dxa"/>
+            </w:tcMar>
+          </w:tcPr>
+          <w:p>
+            <w:pPr>
+              <w:jc w:val="left"/>
+            </w:pPr>
+            <w:r>
+              <w:t>Replay / epoch binding</w:t>
+            </w:r>
+          </w:p>
+        </w:tc>
+        <w:tc>
+          <w:tcPr>
+            <w:tcW w:type="dxa" w:w="3024"/>
+            <w:vAlign w:val="center"/>
+            <w:tcMar>
+              <w:top w:w="100" w:type="dxa"/>
+              <w:start w:w="120" w:type="dxa"/>
+              <w:bottom w:w="100" w:type="dxa"/>
+              <w:end w:w="120" w:type="dxa"/>
+            </w:tcMar>
+          </w:tcPr>
+          <w:p>
+            <w:pPr>
+              <w:jc w:val="center"/>
+            </w:pPr>
+            <w:r>
+              <w:t>REPLAY SURVIVES</w:t>
+            </w:r>
+          </w:p>
+        </w:tc>
+        <w:tc>
+          <w:tcPr>
+            <w:tcW w:type="dxa" w:w="4464"/>
+            <w:vAlign w:val="center"/>
+            <w:tcMar>
+              <w:top w:w="100" w:type="dxa"/>
+              <w:start w:w="120" w:type="dxa"/>
+              <w:bottom w:w="100" w:type="dxa"/>
+              <w:end w:w="120" w:type="dxa"/>
+            </w:tcMar>
+          </w:tcPr>
+          <w:p>
+            <w:pPr>
+              <w:jc w:val="left"/>
+            </w:pPr>
+            <w:r>
+              <w:t>Artifact-level authority-epoch binding remains outside representation.</w:t>
+            </w:r>
+          </w:p>
+        </w:tc>
+      </w:tr>
+      <w:tr>
+        <w:trPr>
+          <w:cantSplit/>
+        </w:trPr>
+        <w:tc>
+          <w:tcPr>
+            <w:tcW w:type="dxa" w:w="2952"/>
+            <w:vAlign w:val="center"/>
+            <w:tcMar>
+              <w:top w:w="100" w:type="dxa"/>
+              <w:start w:w="120" w:type="dxa"/>
+              <w:bottom w:w="100" w:type="dxa"/>
+              <w:end w:w="120" w:type="dxa"/>
+            </w:tcMar>
+          </w:tcPr>
+          <w:p>
+            <w:pPr>
+              <w:jc w:val="left"/>
+            </w:pPr>
+            <w:r>
+              <w:t>Semantic decision-object identity</w:t>
+            </w:r>
+          </w:p>
+        </w:tc>
+        <w:tc>
+          <w:tcPr>
+            <w:tcW w:type="dxa" w:w="3024"/>
+            <w:vAlign w:val="center"/>
+            <w:tcMar>
+              <w:top w:w="100" w:type="dxa"/>
+              <w:start w:w="120" w:type="dxa"/>
+              <w:bottom w:w="100" w:type="dxa"/>
+              <w:end w:w="120" w:type="dxa"/>
+            </w:tcMar>
+          </w:tcPr>
+          <w:p>
+            <w:pPr>
+              <w:jc w:val="center"/>
+            </w:pPr>
+            <w:r>
+              <w:t>REPRESENTATION BOUNDARY</w:t>
+            </w:r>
+          </w:p>
+        </w:tc>
+        <w:tc>
+          <w:tcPr>
+            <w:tcW w:type="dxa" w:w="4464"/>
+            <w:vAlign w:val="center"/>
+            <w:tcMar>
+              <w:top w:w="100" w:type="dxa"/>
+              <w:start w:w="120" w:type="dxa"/>
+              <w:bottom w:w="100" w:type="dxa"/>
+              <w:end w:w="120" w:type="dxa"/>
+            </w:tcMar>
+          </w:tcPr>
+          <w:p>
+            <w:pPr>
+              <w:jc w:val="left"/>
+            </w:pPr>
+            <w:r>
+              <w:t>Executable equivalence does not establish semantic decision-object equivalence.</w:t>
+            </w:r>
+          </w:p>
+        </w:tc>
+      </w:tr>
+      <w:tr>
+        <w:trPr>
+          <w:cantSplit/>
+        </w:trPr>
+        <w:tc>
+          <w:tcPr>
+            <w:tcW w:type="dxa" w:w="2952"/>
+            <w:vAlign w:val="center"/>
+            <w:tcMar>
+              <w:top w:w="100" w:type="dxa"/>
+              <w:start w:w="120" w:type="dxa"/>
+              <w:bottom w:w="100" w:type="dxa"/>
+              <w:end w:w="120" w:type="dxa"/>
+            </w:tcMar>
+          </w:tcPr>
+          <w:p>
+            <w:pPr>
+              <w:jc w:val="left"/>
+            </w:pPr>
+            <w:r>
+              <w:t>Correct organizational authority</w:t>
+            </w:r>
+          </w:p>
+        </w:tc>
+        <w:tc>
+          <w:tcPr>
+            <w:tcW w:type="dxa" w:w="3024"/>
+            <w:vAlign w:val="center"/>
+            <w:tcMar>
+              <w:top w:w="100" w:type="dxa"/>
+              <w:start w:w="120" w:type="dxa"/>
+              <w:bottom w:w="100" w:type="dxa"/>
+              <w:end w:w="120" w:type="dxa"/>
+            </w:tcMar>
+          </w:tcPr>
+          <w:p>
+            <w:pPr>
+              <w:jc w:val="center"/>
+            </w:pPr>
+            <w:r>
+              <w:t>KNOWN LIMIT</w:t>
+            </w:r>
+          </w:p>
+        </w:tc>
+        <w:tc>
+          <w:tcPr>
+            <w:tcW w:type="dxa" w:w="4464"/>
+            <w:vAlign w:val="center"/>
+            <w:tcMar>
+              <w:top w:w="100" w:type="dxa"/>
+              <w:start w:w="120" w:type="dxa"/>
+              <w:bottom w:w="100" w:type="dxa"/>
+              <w:end w:w="120" w:type="dxa"/>
+            </w:tcMar>
+          </w:tcPr>
+          <w:p>
+            <w:pPr>
+              <w:jc w:val="left"/>
+            </w:pPr>
+            <w:r>
+              <w:t>Correct enforcement does not prove correct authority specification.</w:t>
+            </w:r>
+          </w:p>
+        </w:tc>
+      </w:tr>
+      <w:tr>
+        <w:trPr>
+          <w:cantSplit/>
+        </w:trPr>
+        <w:tc>
+          <w:tcPr>
+            <w:tcW w:type="dxa" w:w="2952"/>
+            <w:vAlign w:val="center"/>
+            <w:tcMar>
+              <w:top w:w="100" w:type="dxa"/>
+              <w:start w:w="120" w:type="dxa"/>
+              <w:bottom w:w="100" w:type="dxa"/>
+              <w:end w:w="120" w:type="dxa"/>
+            </w:tcMar>
+          </w:tcPr>
+          <w:p>
+            <w:pPr>
+              <w:jc w:val="left"/>
+            </w:pPr>
+            <w:r>
+              <w:t>Causal/evidentiary fidelity</w:t>
+            </w:r>
+          </w:p>
+        </w:tc>
+        <w:tc>
+          <w:tcPr>
+            <w:tcW w:type="dxa" w:w="3024"/>
+            <w:vAlign w:val="center"/>
+            <w:tcMar>
+              <w:top w:w="100" w:type="dxa"/>
+              <w:start w:w="120" w:type="dxa"/>
+              <w:bottom w:w="100" w:type="dxa"/>
+              <w:end w:w="120" w:type="dxa"/>
+            </w:tcMar>
+          </w:tcPr>
+          <w:p>
+            <w:pPr>
+              <w:jc w:val="center"/>
+            </w:pPr>
+            <w:r>
+              <w:t>RESEARCH QUESTION</w:t>
+            </w:r>
+          </w:p>
+        </w:tc>
+        <w:tc>
+          <w:tcPr>
+            <w:tcW w:type="dxa" w:w="4464"/>
+            <w:vAlign w:val="center"/>
+            <w:tcMar>
+              <w:top w:w="100" w:type="dxa"/>
+              <w:start w:w="120" w:type="dxa"/>
+              <w:bottom w:w="100" w:type="dxa"/>
+              <w:end w:w="120" w:type="dxa"/>
+            </w:tcMar>
+          </w:tcPr>
+          <w:p>
+            <w:pPr>
+              <w:jc w:val="left"/>
+            </w:pPr>
+            <w:r>
+              <w:t>Post-disclosure synthesis; not a frozen V2 finding.</w:t>
             </w:r>
           </w:p>
         </w:tc>
@@ -269,17 +2065,82 @@
         <w:keepNext/>
       </w:pPr>
       <w:r>
-        <w:t>1. Purpose and Method</w:t>
+        <w:t>12. Final V2 claim after combined review</w:t>
       </w:r>
     </w:p>
     <w:p>
+      <w:pPr>
+        <w:spacing w:before="0" w:after="80"/>
+      </w:pPr>
       <w:r>
-        <w:t>This record compares two independently generated bodies of V2 adversarial evidence after Wojciech's assessment was frozen. It does not rewrite Claude's findings, reinterpret Wojciech's review as if he had seen Claude's work, or merge distinct attacks merely because they touch the same architectural boundary.</w:t>
+        <w:rPr>
+          <w:b/>
+          <w:i w:val="0"/>
+          <w:color w:val="1F4E79"/>
+        </w:rPr>
+        <w:t>DEMONSTRATED / SUPPORTED</w:t>
       </w:r>
     </w:p>
     <w:p>
+      <w:pPr>
+        <w:spacing w:before="0" w:after="120"/>
+      </w:pPr>
       <w:r>
-        <w:t>The comparison distinguishes four categories: direct independent convergence; complementary or adjacent findings; reviewer-unique findings; and findings that still require specification or source adjudication. The aim is to sharpen the boundary of what V2 demonstrates, not to manufacture a cleaner result.</w:t>
+        <w:rPr>
+          <w:b w:val="0"/>
+          <w:i w:val="0"/>
+        </w:rPr>
+        <w:t>V2 demonstrates that, within the represented and tested scope of the harness, an organizational authority decision can be translated into an enforceable boundary that causally controls execution.</w:t>
+      </w:r>
+    </w:p>
+    <w:p>
+      <w:pPr>
+        <w:spacing w:before="100" w:after="80"/>
+      </w:pPr>
+      <w:r>
+        <w:rPr>
+          <w:b/>
+          <w:i w:val="0"/>
+          <w:color w:val="1F4E79"/>
+        </w:rPr>
+        <w:t>NOT DEMONSTRATED</w:t>
+      </w:r>
+    </w:p>
+    <w:p>
+      <w:pPr>
+        <w:spacing w:before="0" w:after="120"/>
+      </w:pPr>
+      <w:r>
+        <w:rPr>
+          <w:b w:val="0"/>
+          <w:i w:val="0"/>
+        </w:rPr>
+        <w:t>The combined independent evidence does not demonstrate that the organization selected the correct authority boundary; that recorded authority lineage remains governing after boundary creation; that source authority remains current through a later independent state transition; that materially different authorized decision objects can always be distinguished when their executable shape is identical; or that a structurally distinguishable execution reason guarantees a causally faithful evidence narrative.</w:t>
+      </w:r>
+    </w:p>
+    <w:p>
+      <w:pPr>
+        <w:spacing w:before="100" w:after="80"/>
+      </w:pPr>
+      <w:r>
+        <w:rPr>
+          <w:b/>
+          <w:i w:val="0"/>
+          <w:color w:val="1F4E79"/>
+        </w:rPr>
+        <w:t>RESEARCH QUESTION</w:t>
+      </w:r>
+    </w:p>
+    <w:p>
+      <w:pPr>
+        <w:spacing w:before="0" w:after="120"/>
+      </w:pPr>
+      <w:r>
+        <w:rPr>
+          <w:b w:val="0"/>
+          <w:i w:val="0"/>
+        </w:rPr>
+        <w:t>The combined review raises a further question about what relationships among organizational authority, represented authority, executable boundary, and recorded causal explanation must remain aligned for an execution artifact to remain both causally operative and evidentially faithful. V2 does not answer that question.</w:t>
       </w:r>
     </w:p>
     <w:p>
@@ -288,2305 +2149,37 @@
         <w:keepNext/>
       </w:pPr>
       <w:r>
-        <w:t>2. Source Records Compared</w:t>
+        <w:t>13. Preservation and next-action boundary</w:t>
       </w:r>
     </w:p>
     <w:p>
       <w:pPr>
-        <w:pStyle w:val="ListBullet"/>
+        <w:spacing w:before="0" w:after="120"/>
       </w:pPr>
       <w:r>
-        <w:t>Claude V2 Final Adversarial Review Record and its preserved raw deliverables.</w:t>
+        <w:rPr>
+          <w:b w:val="0"/>
+          <w:i w:val="0"/>
+        </w:rPr>
+        <w:t>This adjudication changes the synthesis record only. It does not alter the frozen V2 release, Claude's preserved independent review, Wojciech's frozen independent assessment, Wojciech's reviewer confirmation, or Wojciech's post-disclosure response.</w:t>
       </w:r>
     </w:p>
     <w:p>
       <w:pPr>
-        <w:pStyle w:val="ListBullet"/>
+        <w:spacing w:before="0" w:after="120"/>
       </w:pPr>
       <w:r>
-        <w:t>Wojciech V2 Final Independent Adversarial Assessment and the preserved raw LinkedIn message thread.</w:t>
-      </w:r>
-    </w:p>
-    <w:p>
-      <w:pPr>
-        <w:pStyle w:val="ListBullet"/>
-      </w:pPr>
-      <w:r>
-        <w:t>Frozen V2.0.0 release as the common historical target; neither comparison nor this record changes that artifact.</w:t>
-      </w:r>
-    </w:p>
-    <w:p>
-      <w:pPr>
-        <w:pStyle w:val="Heading1"/>
-        <w:keepNext/>
-      </w:pPr>
-      <w:r>
-        <w:t>3. Cross-Review Matrix</w:t>
-      </w:r>
-    </w:p>
-    <w:tbl>
-      <w:tblPr>
-        <w:tblStyle w:val="TableGrid"/>
-        <w:tblW w:type="auto" w:w="0"/>
-        <w:jc w:val="center"/>
-        <w:tblLook w:firstColumn="1" w:firstRow="1" w:lastColumn="0" w:lastRow="0" w:noHBand="0" w:noVBand="1" w:val="04A0"/>
-      </w:tblPr>
-      <w:tblGrid>
-        <w:gridCol w:w="2541"/>
-        <w:gridCol w:w="2541"/>
-        <w:gridCol w:w="2541"/>
-        <w:gridCol w:w="2541"/>
-      </w:tblGrid>
-      <w:tr>
-        <w:trPr>
-          <w:tblHeader w:val="true"/>
-        </w:trPr>
-        <w:tc>
-          <w:tcPr>
-            <w:tcW w:type="dxa" w:w="2541"/>
-            <w:shd w:fill="1F4E79"/>
-            <w:vAlign w:val="center"/>
-            <w:tcMar>
-              <w:top w:w="110" w:type="dxa"/>
-              <w:start w:w="110" w:type="dxa"/>
-              <w:bottom w:w="110" w:type="dxa"/>
-              <w:end w:w="110" w:type="dxa"/>
-            </w:tcMar>
-          </w:tcPr>
-          <w:p>
-            <w:r>
-              <w:rPr>
-                <w:b/>
-                <w:color w:val="FFFFFF"/>
-                <w:sz w:val="18"/>
-              </w:rPr>
-              <w:t>Area</w:t>
-            </w:r>
-          </w:p>
-        </w:tc>
-        <w:tc>
-          <w:tcPr>
-            <w:tcW w:type="dxa" w:w="2541"/>
-            <w:shd w:fill="1F4E79"/>
-            <w:vAlign w:val="center"/>
-            <w:tcMar>
-              <w:top w:w="110" w:type="dxa"/>
-              <w:start w:w="110" w:type="dxa"/>
-              <w:bottom w:w="110" w:type="dxa"/>
-              <w:end w:w="110" w:type="dxa"/>
-            </w:tcMar>
-          </w:tcPr>
-          <w:p>
-            <w:r>
-              <w:rPr>
-                <w:b/>
-                <w:color w:val="FFFFFF"/>
-                <w:sz w:val="18"/>
-              </w:rPr>
-              <w:t>Claude</w:t>
-            </w:r>
-          </w:p>
-        </w:tc>
-        <w:tc>
-          <w:tcPr>
-            <w:tcW w:type="dxa" w:w="2541"/>
-            <w:shd w:fill="1F4E79"/>
-            <w:vAlign w:val="center"/>
-            <w:tcMar>
-              <w:top w:w="110" w:type="dxa"/>
-              <w:start w:w="110" w:type="dxa"/>
-              <w:bottom w:w="110" w:type="dxa"/>
-              <w:end w:w="110" w:type="dxa"/>
-            </w:tcMar>
-          </w:tcPr>
-          <w:p>
-            <w:r>
-              <w:rPr>
-                <w:b/>
-                <w:color w:val="FFFFFF"/>
-                <w:sz w:val="18"/>
-              </w:rPr>
-              <w:t>Wojciech</w:t>
-            </w:r>
-          </w:p>
-        </w:tc>
-        <w:tc>
-          <w:tcPr>
-            <w:tcW w:type="dxa" w:w="2541"/>
-            <w:shd w:fill="1F4E79"/>
-            <w:vAlign w:val="center"/>
-            <w:tcMar>
-              <w:top w:w="110" w:type="dxa"/>
-              <w:start w:w="110" w:type="dxa"/>
-              <w:bottom w:w="110" w:type="dxa"/>
-              <w:end w:w="110" w:type="dxa"/>
-            </w:tcMar>
-          </w:tcPr>
-          <w:p>
-            <w:r>
-              <w:rPr>
-                <w:b/>
-                <w:color w:val="FFFFFF"/>
-                <w:sz w:val="18"/>
-              </w:rPr>
-              <w:t>Adjudication</w:t>
-            </w:r>
-          </w:p>
-        </w:tc>
-      </w:tr>
-      <w:tr>
-        <w:trPr>
-          <w:cantSplit/>
-        </w:trPr>
-        <w:tc>
-          <w:tcPr>
-            <w:tcW w:type="dxa" w:w="2541"/>
-            <w:vAlign w:val="center"/>
-            <w:tcMar>
-              <w:top w:w="95" w:type="dxa"/>
-              <w:start w:w="105" w:type="dxa"/>
-              <w:bottom w:w="95" w:type="dxa"/>
-              <w:end w:w="105" w:type="dxa"/>
-            </w:tcMar>
-          </w:tcPr>
-          <w:p>
-            <w:pPr>
-              <w:spacing w:after="0" w:line="240" w:lineRule="auto"/>
-            </w:pPr>
-            <w:r>
-              <w:rPr>
-                <w:b/>
-                <w:sz w:val="16"/>
-              </w:rPr>
-              <w:t>Boundary causality</w:t>
-            </w:r>
-          </w:p>
-        </w:tc>
-        <w:tc>
-          <w:tcPr>
-            <w:tcW w:type="dxa" w:w="2541"/>
-            <w:vAlign w:val="center"/>
-            <w:tcMar>
-              <w:top w:w="95" w:type="dxa"/>
-              <w:start w:w="105" w:type="dxa"/>
-              <w:bottom w:w="95" w:type="dxa"/>
-              <w:end w:w="105" w:type="dxa"/>
-            </w:tcMar>
-          </w:tcPr>
-          <w:p>
-            <w:pPr>
-              <w:spacing w:after="0" w:line="240" w:lineRule="auto"/>
-            </w:pPr>
-            <w:r>
-              <w:rPr>
-                <w:sz w:val="16"/>
-              </w:rPr>
-              <w:t>Inside/outside and matched-pair cases showed that boundary membership and conditions can flip execution.</w:t>
-            </w:r>
-          </w:p>
-        </w:tc>
-        <w:tc>
-          <w:tcPr>
-            <w:tcW w:type="dxa" w:w="2541"/>
-            <w:vAlign w:val="center"/>
-            <w:tcMar>
-              <w:top w:w="95" w:type="dxa"/>
-              <w:start w:w="105" w:type="dxa"/>
-              <w:bottom w:w="95" w:type="dxa"/>
-              <w:end w:w="105" w:type="dxa"/>
-            </w:tcMar>
-          </w:tcPr>
-          <w:p>
-            <w:pPr>
-              <w:spacing w:after="0" w:line="240" w:lineRule="auto"/>
-            </w:pPr>
-            <w:r>
-              <w:rPr>
-                <w:sz w:val="16"/>
-              </w:rPr>
-              <w:t>SURVIVES - enforceable boundary is causally operative at execution.</w:t>
-            </w:r>
-          </w:p>
-        </w:tc>
-        <w:tc>
-          <w:tcPr>
-            <w:tcW w:type="dxa" w:w="2541"/>
-            <w:vAlign w:val="center"/>
-            <w:tcMar>
-              <w:top w:w="95" w:type="dxa"/>
-              <w:start w:w="105" w:type="dxa"/>
-              <w:bottom w:w="95" w:type="dxa"/>
-              <w:end w:w="105" w:type="dxa"/>
-            </w:tcMar>
-          </w:tcPr>
-          <w:p>
-            <w:pPr>
-              <w:spacing w:after="0" w:line="240" w:lineRule="auto"/>
-            </w:pPr>
-            <w:r>
-              <w:rPr>
-                <w:sz w:val="16"/>
-              </w:rPr>
-              <w:t>DIRECT CONVERGENCE. Both independently support the central V2 mechanism.</w:t>
-            </w:r>
-          </w:p>
-        </w:tc>
-      </w:tr>
-      <w:tr>
-        <w:trPr>
-          <w:cantSplit/>
-        </w:trPr>
-        <w:tc>
-          <w:tcPr>
-            <w:tcW w:type="dxa" w:w="2541"/>
-            <w:vAlign w:val="center"/>
-            <w:tcMar>
-              <w:top w:w="95" w:type="dxa"/>
-              <w:start w:w="105" w:type="dxa"/>
-              <w:bottom w:w="95" w:type="dxa"/>
-              <w:end w:w="105" w:type="dxa"/>
-            </w:tcMar>
-          </w:tcPr>
-          <w:p>
-            <w:pPr>
-              <w:spacing w:after="0" w:line="240" w:lineRule="auto"/>
-            </w:pPr>
-            <w:r>
-              <w:rPr>
-                <w:b/>
-                <w:sz w:val="16"/>
-              </w:rPr>
-              <w:t>Unauthorized execution</w:t>
-            </w:r>
-          </w:p>
-        </w:tc>
-        <w:tc>
-          <w:tcPr>
-            <w:tcW w:type="dxa" w:w="2541"/>
-            <w:vAlign w:val="center"/>
-            <w:tcMar>
-              <w:top w:w="95" w:type="dxa"/>
-              <w:start w:w="105" w:type="dxa"/>
-              <w:bottom w:w="95" w:type="dxa"/>
-              <w:end w:w="105" w:type="dxa"/>
-            </w:tcMar>
-          </w:tcPr>
-          <w:p>
-            <w:pPr>
-              <w:spacing w:after="0" w:line="240" w:lineRule="auto"/>
-            </w:pPr>
-            <w:r>
-              <w:rPr>
-                <w:sz w:val="16"/>
-              </w:rPr>
-              <w:t>No tested case produced ALLOW with zero underlying executable authority; ordinary TRANSFER, REFUSE and SUSPEND paths did not leave executable authority in place.</w:t>
-            </w:r>
-          </w:p>
-        </w:tc>
-        <w:tc>
-          <w:tcPr>
-            <w:tcW w:type="dxa" w:w="2541"/>
-            <w:vAlign w:val="center"/>
-            <w:tcMar>
-              <w:top w:w="95" w:type="dxa"/>
-              <w:start w:w="105" w:type="dxa"/>
-              <w:bottom w:w="95" w:type="dxa"/>
-              <w:end w:w="105" w:type="dxa"/>
-            </w:tcMar>
-          </w:tcPr>
-          <w:p>
-            <w:pPr>
-              <w:spacing w:after="0" w:line="240" w:lineRule="auto"/>
-            </w:pPr>
-            <w:r>
-              <w:rPr>
-                <w:sz w:val="16"/>
-              </w:rPr>
-              <w:t>SURVIVES - non-ACTIVE authority cannot create a new executable boundary.</w:t>
-            </w:r>
-          </w:p>
-        </w:tc>
-        <w:tc>
-          <w:tcPr>
-            <w:tcW w:type="dxa" w:w="2541"/>
-            <w:vAlign w:val="center"/>
-            <w:tcMar>
-              <w:top w:w="95" w:type="dxa"/>
-              <w:start w:w="105" w:type="dxa"/>
-              <w:bottom w:w="95" w:type="dxa"/>
-              <w:end w:w="105" w:type="dxa"/>
-            </w:tcMar>
-          </w:tcPr>
-          <w:p>
-            <w:pPr>
-              <w:spacing w:after="0" w:line="240" w:lineRule="auto"/>
-            </w:pPr>
-            <w:r>
-              <w:rPr>
-                <w:sz w:val="16"/>
-              </w:rPr>
-              <w:t>STRONG POSITIVE CONVERGENCE, reached through different tests.</w:t>
-            </w:r>
-          </w:p>
-        </w:tc>
-      </w:tr>
-      <w:tr>
-        <w:trPr>
-          <w:cantSplit/>
-        </w:trPr>
-        <w:tc>
-          <w:tcPr>
-            <w:tcW w:type="dxa" w:w="2541"/>
-            <w:vAlign w:val="center"/>
-            <w:tcMar>
-              <w:top w:w="95" w:type="dxa"/>
-              <w:start w:w="105" w:type="dxa"/>
-              <w:bottom w:w="95" w:type="dxa"/>
-              <w:end w:w="105" w:type="dxa"/>
-            </w:tcMar>
-          </w:tcPr>
-          <w:p>
-            <w:pPr>
-              <w:spacing w:after="0" w:line="240" w:lineRule="auto"/>
-            </w:pPr>
-            <w:r>
-              <w:rPr>
-                <w:b/>
-                <w:sz w:val="16"/>
-              </w:rPr>
-              <w:t>Correct result vs. correct causal explanation</w:t>
-            </w:r>
-          </w:p>
-        </w:tc>
-        <w:tc>
-          <w:tcPr>
-            <w:tcW w:type="dxa" w:w="2541"/>
-            <w:vAlign w:val="center"/>
-            <w:tcMar>
-              <w:top w:w="95" w:type="dxa"/>
-              <w:start w:w="105" w:type="dxa"/>
-              <w:bottom w:w="95" w:type="dxa"/>
-              <w:end w:w="105" w:type="dxa"/>
-            </w:tcMar>
-          </w:tcPr>
-          <w:p>
-            <w:pPr>
-              <w:spacing w:after="0" w:line="240" w:lineRule="auto"/>
-            </w:pPr>
-            <w:r>
-              <w:rPr>
-                <w:sz w:val="16"/>
-              </w:rPr>
-              <w:t>F-1 produced a safe BLOCK while surfacing the wrong materiality/authority narrative.</w:t>
-            </w:r>
-          </w:p>
-        </w:tc>
-        <w:tc>
-          <w:tcPr>
-            <w:tcW w:type="dxa" w:w="2541"/>
-            <w:vAlign w:val="center"/>
-            <w:tcMar>
-              <w:top w:w="95" w:type="dxa"/>
-              <w:start w:w="105" w:type="dxa"/>
-              <w:bottom w:w="95" w:type="dxa"/>
-              <w:end w:w="105" w:type="dxa"/>
-            </w:tcMar>
-          </w:tcPr>
-          <w:p>
-            <w:pPr>
-              <w:spacing w:after="0" w:line="240" w:lineRule="auto"/>
-            </w:pPr>
-            <w:r>
-              <w:rPr>
-                <w:sz w:val="16"/>
-              </w:rPr>
-              <w:t>SURVIVES - V2 normally retains distinct BLOCK reasons; outcome alone is not sufficient evidence of mechanism.</w:t>
-            </w:r>
-          </w:p>
-        </w:tc>
-        <w:tc>
-          <w:tcPr>
-            <w:tcW w:type="dxa" w:w="2541"/>
-            <w:vAlign w:val="center"/>
-            <w:tcMar>
-              <w:top w:w="95" w:type="dxa"/>
-              <w:start w:w="105" w:type="dxa"/>
-              <w:bottom w:w="95" w:type="dxa"/>
-              <w:end w:w="105" w:type="dxa"/>
-            </w:tcMar>
-          </w:tcPr>
-          <w:p>
-            <w:pPr>
-              <w:spacing w:after="0" w:line="240" w:lineRule="auto"/>
-            </w:pPr>
-            <w:r>
-              <w:rPr>
-                <w:sz w:val="16"/>
-              </w:rPr>
-              <w:t>COMPLEMENTARY. Representation can preserve causes, while a specific implementation path may still populate the wrong cause.</w:t>
-            </w:r>
-          </w:p>
-        </w:tc>
-      </w:tr>
-      <w:tr>
-        <w:trPr>
-          <w:cantSplit/>
-        </w:trPr>
-        <w:tc>
-          <w:tcPr>
-            <w:tcW w:type="dxa" w:w="2541"/>
-            <w:vAlign w:val="center"/>
-            <w:tcMar>
-              <w:top w:w="95" w:type="dxa"/>
-              <w:start w:w="105" w:type="dxa"/>
-              <w:bottom w:w="95" w:type="dxa"/>
-              <w:end w:w="105" w:type="dxa"/>
-            </w:tcMar>
-          </w:tcPr>
-          <w:p>
-            <w:pPr>
-              <w:spacing w:after="0" w:line="240" w:lineRule="auto"/>
-            </w:pPr>
-            <w:r>
-              <w:rPr>
-                <w:b/>
-                <w:sz w:val="16"/>
-              </w:rPr>
-              <w:t>Temporal/currentness</w:t>
-            </w:r>
-          </w:p>
-        </w:tc>
-        <w:tc>
-          <w:tcPr>
-            <w:tcW w:type="dxa" w:w="2541"/>
-            <w:vAlign w:val="center"/>
-            <w:tcMar>
-              <w:top w:w="95" w:type="dxa"/>
-              <w:start w:w="105" w:type="dxa"/>
-              <w:bottom w:w="95" w:type="dxa"/>
-              <w:end w:w="105" w:type="dxa"/>
-            </w:tcMar>
-          </w:tcPr>
-          <w:p>
-            <w:pPr>
-              <w:spacing w:after="0" w:line="240" w:lineRule="auto"/>
-            </w:pPr>
-            <w:r>
-              <w:rPr>
-                <w:sz w:val="16"/>
-              </w:rPr>
-              <w:t>One ACCESS order/history anomaly suggested possible state propagation, but controlled retest did not reproduce it.</w:t>
-            </w:r>
-          </w:p>
-        </w:tc>
-        <w:tc>
-          <w:tcPr>
-            <w:tcW w:type="dxa" w:w="2541"/>
-            <w:vAlign w:val="center"/>
-            <w:tcMar>
-              <w:top w:w="95" w:type="dxa"/>
-              <w:start w:w="105" w:type="dxa"/>
-              <w:bottom w:w="95" w:type="dxa"/>
-              <w:end w:w="105" w:type="dxa"/>
-            </w:tcMar>
-          </w:tcPr>
-          <w:p>
-            <w:pPr>
-              <w:spacing w:after="0" w:line="240" w:lineRule="auto"/>
-            </w:pPr>
-            <w:r>
-              <w:rPr>
-                <w:sz w:val="16"/>
-              </w:rPr>
-              <w:t>CANNOT DISCRIMINATE - V2 does not model authority becoming stale after valid boundary creation and before later execution.</w:t>
-            </w:r>
-          </w:p>
-        </w:tc>
-        <w:tc>
-          <w:tcPr>
-            <w:tcW w:type="dxa" w:w="2541"/>
-            <w:vAlign w:val="center"/>
-            <w:tcMar>
-              <w:top w:w="95" w:type="dxa"/>
-              <w:start w:w="105" w:type="dxa"/>
-              <w:bottom w:w="95" w:type="dxa"/>
-              <w:end w:w="105" w:type="dxa"/>
-            </w:tcMar>
-          </w:tcPr>
-          <w:p>
-            <w:pPr>
-              <w:spacing w:after="0" w:line="240" w:lineRule="auto"/>
-            </w:pPr>
-            <w:r>
-              <w:rPr>
-                <w:sz w:val="16"/>
-              </w:rPr>
-              <w:t>ADJACENT, NOT DUPLICATE. Claude found an unconfirmed symptom; Wojciech located a state-transition space the representation does not model.</w:t>
-            </w:r>
-          </w:p>
-        </w:tc>
-      </w:tr>
-      <w:tr>
-        <w:trPr>
-          <w:cantSplit/>
-        </w:trPr>
-        <w:tc>
-          <w:tcPr>
-            <w:tcW w:type="dxa" w:w="2541"/>
-            <w:vAlign w:val="center"/>
-            <w:tcMar>
-              <w:top w:w="95" w:type="dxa"/>
-              <w:start w:w="105" w:type="dxa"/>
-              <w:bottom w:w="95" w:type="dxa"/>
-              <w:end w:w="105" w:type="dxa"/>
-            </w:tcMar>
-          </w:tcPr>
-          <w:p>
-            <w:pPr>
-              <w:spacing w:after="0" w:line="240" w:lineRule="auto"/>
-            </w:pPr>
-            <w:r>
-              <w:rPr>
-                <w:b/>
-                <w:sz w:val="16"/>
-              </w:rPr>
-              <w:t>Authority lineage</w:t>
-            </w:r>
-          </w:p>
-        </w:tc>
-        <w:tc>
-          <w:tcPr>
-            <w:tcW w:type="dxa" w:w="2541"/>
-            <w:vAlign w:val="center"/>
-            <w:tcMar>
-              <w:top w:w="95" w:type="dxa"/>
-              <w:start w:w="105" w:type="dxa"/>
-              <w:bottom w:w="95" w:type="dxa"/>
-              <w:end w:w="105" w:type="dxa"/>
-            </w:tcMar>
-          </w:tcPr>
-          <w:p>
-            <w:pPr>
-              <w:spacing w:after="0" w:line="240" w:lineRule="auto"/>
-            </w:pPr>
-            <w:r>
-              <w:rPr>
-                <w:sz w:val="16"/>
-              </w:rPr>
-              <w:t>Not independently isolated in the final Claude matrix.</w:t>
-            </w:r>
-          </w:p>
-        </w:tc>
-        <w:tc>
-          <w:tcPr>
-            <w:tcW w:type="dxa" w:w="2541"/>
-            <w:vAlign w:val="center"/>
-            <w:tcMar>
-              <w:top w:w="95" w:type="dxa"/>
-              <w:start w:w="105" w:type="dxa"/>
-              <w:bottom w:w="95" w:type="dxa"/>
-              <w:end w:w="105" w:type="dxa"/>
-            </w:tcMar>
-          </w:tcPr>
-          <w:p>
-            <w:pPr>
-              <w:spacing w:after="0" w:line="240" w:lineRule="auto"/>
-            </w:pPr>
-            <w:r>
-              <w:rPr>
-                <w:sz w:val="16"/>
-              </w:rPr>
-              <w:t>CANNOT DISCRIMINATE - lineage is recorded and auditable but not independently consumed as an execution predicate after boundary creation. Wojciech also cautioned that the normal governed pipeline may already prevent illegitimate lineage upstream.</w:t>
-            </w:r>
-          </w:p>
-        </w:tc>
-        <w:tc>
-          <w:tcPr>
-            <w:tcW w:type="dxa" w:w="2541"/>
-            <w:vAlign w:val="center"/>
-            <w:tcMar>
-              <w:top w:w="95" w:type="dxa"/>
-              <w:start w:w="105" w:type="dxa"/>
-              <w:bottom w:w="95" w:type="dxa"/>
-              <w:end w:w="105" w:type="dxa"/>
-            </w:tcMar>
-          </w:tcPr>
-          <w:p>
-            <w:pPr>
-              <w:spacing w:after="0" w:line="240" w:lineRule="auto"/>
-            </w:pPr>
-            <w:r>
-              <w:rPr>
-                <w:sz w:val="16"/>
-              </w:rPr>
-              <w:t>WOJCIECH-UNIQUE FINDING, WITH IMPORTANT QUALIFICATION: this does not establish that normal governed V2 runs routinely create illegitimate authority lineage.</w:t>
-            </w:r>
-          </w:p>
-        </w:tc>
-      </w:tr>
-      <w:tr>
-        <w:trPr>
-          <w:cantSplit/>
-        </w:trPr>
-        <w:tc>
-          <w:tcPr>
-            <w:tcW w:type="dxa" w:w="2541"/>
-            <w:vAlign w:val="center"/>
-            <w:tcMar>
-              <w:top w:w="95" w:type="dxa"/>
-              <w:start w:w="105" w:type="dxa"/>
-              <w:bottom w:w="95" w:type="dxa"/>
-              <w:end w:w="105" w:type="dxa"/>
-            </w:tcMar>
-          </w:tcPr>
-          <w:p>
-            <w:pPr>
-              <w:spacing w:after="0" w:line="240" w:lineRule="auto"/>
-            </w:pPr>
-            <w:r>
-              <w:rPr>
-                <w:b/>
-                <w:sz w:val="16"/>
-              </w:rPr>
-              <w:t>Policy/scenario drift</w:t>
-            </w:r>
-          </w:p>
-        </w:tc>
-        <w:tc>
-          <w:tcPr>
-            <w:tcW w:type="dxa" w:w="2541"/>
-            <w:vAlign w:val="center"/>
-            <w:tcMar>
-              <w:top w:w="95" w:type="dxa"/>
-              <w:start w:w="105" w:type="dxa"/>
-              <w:bottom w:w="95" w:type="dxa"/>
-              <w:end w:w="105" w:type="dxa"/>
-            </w:tcMar>
-          </w:tcPr>
-          <w:p>
-            <w:pPr>
-              <w:spacing w:after="0" w:line="240" w:lineRule="auto"/>
-            </w:pPr>
-            <w:r>
-              <w:rPr>
-                <w:sz w:val="16"/>
-              </w:rPr>
-              <w:t>Not isolated as a distinct representational attack.</w:t>
-            </w:r>
-          </w:p>
-        </w:tc>
-        <w:tc>
-          <w:tcPr>
-            <w:tcW w:type="dxa" w:w="2541"/>
-            <w:vAlign w:val="center"/>
-            <w:tcMar>
-              <w:top w:w="95" w:type="dxa"/>
-              <w:start w:w="105" w:type="dxa"/>
-              <w:bottom w:w="95" w:type="dxa"/>
-              <w:end w:w="105" w:type="dxa"/>
-            </w:tcMar>
-          </w:tcPr>
-          <w:p>
-            <w:pPr>
-              <w:spacing w:after="0" w:line="240" w:lineRule="auto"/>
-            </w:pPr>
-            <w:r>
-              <w:rPr>
-                <w:sz w:val="16"/>
-              </w:rPr>
-              <w:t>NOT INDEPENDENT - subsumed by governing provenance because scenarioVersion and policyVersion are recorded but not execution predicates.</w:t>
-            </w:r>
-          </w:p>
-        </w:tc>
-        <w:tc>
-          <w:tcPr>
-            <w:tcW w:type="dxa" w:w="2541"/>
-            <w:vAlign w:val="center"/>
-            <w:tcMar>
-              <w:top w:w="95" w:type="dxa"/>
-              <w:start w:w="105" w:type="dxa"/>
-              <w:bottom w:w="95" w:type="dxa"/>
-              <w:end w:w="105" w:type="dxa"/>
-            </w:tcMar>
-          </w:tcPr>
-          <w:p>
-            <w:pPr>
-              <w:spacing w:after="0" w:line="240" w:lineRule="auto"/>
-            </w:pPr>
-            <w:r>
-              <w:rPr>
-                <w:sz w:val="16"/>
-              </w:rPr>
-              <w:t>WOJCIECH-UNIQUE CLASSIFICATION.</w:t>
-            </w:r>
-          </w:p>
-        </w:tc>
-      </w:tr>
-      <w:tr>
-        <w:trPr>
-          <w:cantSplit/>
-        </w:trPr>
-        <w:tc>
-          <w:tcPr>
-            <w:tcW w:type="dxa" w:w="2541"/>
-            <w:vAlign w:val="center"/>
-            <w:tcMar>
-              <w:top w:w="95" w:type="dxa"/>
-              <w:start w:w="105" w:type="dxa"/>
-              <w:bottom w:w="95" w:type="dxa"/>
-              <w:end w:w="105" w:type="dxa"/>
-            </w:tcMar>
-          </w:tcPr>
-          <w:p>
-            <w:pPr>
-              <w:spacing w:after="0" w:line="240" w:lineRule="auto"/>
-            </w:pPr>
-            <w:r>
-              <w:rPr>
-                <w:b/>
-                <w:sz w:val="16"/>
-              </w:rPr>
-              <w:t>Replay</w:t>
-            </w:r>
-          </w:p>
-        </w:tc>
-        <w:tc>
-          <w:tcPr>
-            <w:tcW w:type="dxa" w:w="2541"/>
-            <w:vAlign w:val="center"/>
-            <w:tcMar>
-              <w:top w:w="95" w:type="dxa"/>
-              <w:start w:w="105" w:type="dxa"/>
-              <w:bottom w:w="95" w:type="dxa"/>
-              <w:end w:w="105" w:type="dxa"/>
-            </w:tcMar>
-          </w:tcPr>
-          <w:p>
-            <w:pPr>
-              <w:spacing w:after="0" w:line="240" w:lineRule="auto"/>
-            </w:pPr>
-            <w:r>
-              <w:rPr>
-                <w:sz w:val="16"/>
-              </w:rPr>
-              <w:t>Only 1 of 60 replay/determinism families was executed in the final Claude review.</w:t>
-            </w:r>
-          </w:p>
-        </w:tc>
-        <w:tc>
-          <w:tcPr>
-            <w:tcW w:type="dxa" w:w="2541"/>
-            <w:vAlign w:val="center"/>
-            <w:tcMar>
-              <w:top w:w="95" w:type="dxa"/>
-              <w:start w:w="105" w:type="dxa"/>
-              <w:bottom w:w="95" w:type="dxa"/>
-              <w:end w:w="105" w:type="dxa"/>
-            </w:tcMar>
-          </w:tcPr>
-          <w:p>
-            <w:pPr>
-              <w:spacing w:after="0" w:line="240" w:lineRule="auto"/>
-            </w:pPr>
-            <w:r>
-              <w:rPr>
-                <w:sz w:val="16"/>
-              </w:rPr>
-              <w:t>REPLAY - official replay regenerates the governed chain; boundary artifact is not independently bound to its originating run or authority epoch.</w:t>
-            </w:r>
-          </w:p>
-        </w:tc>
-        <w:tc>
-          <w:tcPr>
-            <w:tcW w:type="dxa" w:w="2541"/>
-            <w:vAlign w:val="center"/>
-            <w:tcMar>
-              <w:top w:w="95" w:type="dxa"/>
-              <w:start w:w="105" w:type="dxa"/>
-              <w:bottom w:w="95" w:type="dxa"/>
-              <w:end w:w="105" w:type="dxa"/>
-            </w:tcMar>
-          </w:tcPr>
-          <w:p>
-            <w:pPr>
-              <w:spacing w:after="0" w:line="240" w:lineRule="auto"/>
-            </w:pPr>
-            <w:r>
-              <w:rPr>
-                <w:sz w:val="16"/>
-              </w:rPr>
-              <w:t>WOJCIECH PROVIDES THE STRONGER ARCHITECTURAL RESULT; Claude coverage is insufficient for a strong cross-check.</w:t>
-            </w:r>
-          </w:p>
-        </w:tc>
-      </w:tr>
-      <w:tr>
-        <w:trPr>
-          <w:cantSplit/>
-        </w:trPr>
-        <w:tc>
-          <w:tcPr>
-            <w:tcW w:type="dxa" w:w="2541"/>
-            <w:vAlign w:val="center"/>
-            <w:tcMar>
-              <w:top w:w="95" w:type="dxa"/>
-              <w:start w:w="105" w:type="dxa"/>
-              <w:bottom w:w="95" w:type="dxa"/>
-              <w:end w:w="105" w:type="dxa"/>
-            </w:tcMar>
-          </w:tcPr>
-          <w:p>
-            <w:pPr>
-              <w:spacing w:after="0" w:line="240" w:lineRule="auto"/>
-            </w:pPr>
-            <w:r>
-              <w:rPr>
-                <w:b/>
-                <w:sz w:val="16"/>
-              </w:rPr>
-              <w:t>Wrong organizational boundary</w:t>
-            </w:r>
-          </w:p>
-        </w:tc>
-        <w:tc>
-          <w:tcPr>
-            <w:tcW w:type="dxa" w:w="2541"/>
-            <w:vAlign w:val="center"/>
-            <w:tcMar>
-              <w:top w:w="95" w:type="dxa"/>
-              <w:start w:w="105" w:type="dxa"/>
-              <w:bottom w:w="95" w:type="dxa"/>
-              <w:end w:w="105" w:type="dxa"/>
-            </w:tcMar>
-          </w:tcPr>
-          <w:p>
-            <w:pPr>
-              <w:spacing w:after="0" w:line="240" w:lineRule="auto"/>
-            </w:pPr>
-            <w:r>
-              <w:rPr>
-                <w:sz w:val="16"/>
-              </w:rPr>
-              <w:t>Procurement NARROW exposed a dispute over whether the selected governed metric was being honored or whether the old equipment-price basis was intentionally being narrowed.</w:t>
-            </w:r>
-          </w:p>
-        </w:tc>
-        <w:tc>
-          <w:tcPr>
-            <w:tcW w:type="dxa" w:w="2541"/>
-            <w:vAlign w:val="center"/>
-            <w:tcMar>
-              <w:top w:w="95" w:type="dxa"/>
-              <w:start w:w="105" w:type="dxa"/>
-              <w:bottom w:w="95" w:type="dxa"/>
-              <w:end w:w="105" w:type="dxa"/>
-            </w:tcMar>
-          </w:tcPr>
-          <w:p>
-            <w:pPr>
-              <w:spacing w:after="0" w:line="240" w:lineRule="auto"/>
-            </w:pPr>
-            <w:r>
-              <w:rPr>
-                <w:sz w:val="16"/>
-              </w:rPr>
-              <w:t>KNOWN LIMIT - correct enforcement does not prove the organization specified the correct authority boundary.</w:t>
-            </w:r>
-          </w:p>
-        </w:tc>
-        <w:tc>
-          <w:tcPr>
-            <w:tcW w:type="dxa" w:w="2541"/>
-            <w:vAlign w:val="center"/>
-            <w:tcMar>
-              <w:top w:w="95" w:type="dxa"/>
-              <w:start w:w="105" w:type="dxa"/>
-              <w:bottom w:w="95" w:type="dxa"/>
-              <w:end w:w="105" w:type="dxa"/>
-            </w:tcMar>
-          </w:tcPr>
-          <w:p>
-            <w:pPr>
-              <w:spacing w:after="0" w:line="240" w:lineRule="auto"/>
-            </w:pPr>
-            <w:r>
-              <w:rPr>
-                <w:sz w:val="16"/>
-              </w:rPr>
-              <w:t>STRONG CONCEPTUAL CONVERGENCE on enforcement correctness versus authority/specification correctness.</w:t>
-            </w:r>
-          </w:p>
-        </w:tc>
-      </w:tr>
-      <w:tr>
-        <w:trPr>
-          <w:cantSplit/>
-        </w:trPr>
-        <w:tc>
-          <w:tcPr>
-            <w:tcW w:type="dxa" w:w="2541"/>
-            <w:vAlign w:val="center"/>
-            <w:tcMar>
-              <w:top w:w="95" w:type="dxa"/>
-              <w:start w:w="105" w:type="dxa"/>
-              <w:bottom w:w="95" w:type="dxa"/>
-              <w:end w:w="105" w:type="dxa"/>
-            </w:tcMar>
-          </w:tcPr>
-          <w:p>
-            <w:pPr>
-              <w:spacing w:after="0" w:line="240" w:lineRule="auto"/>
-            </w:pPr>
-            <w:r>
-              <w:rPr>
-                <w:b/>
-                <w:sz w:val="16"/>
-              </w:rPr>
-              <w:t>Semantic decision-object identity</w:t>
-            </w:r>
-          </w:p>
-        </w:tc>
-        <w:tc>
-          <w:tcPr>
-            <w:tcW w:type="dxa" w:w="2541"/>
-            <w:vAlign w:val="center"/>
-            <w:tcMar>
-              <w:top w:w="95" w:type="dxa"/>
-              <w:start w:w="105" w:type="dxa"/>
-              <w:bottom w:w="95" w:type="dxa"/>
-              <w:end w:w="105" w:type="dxa"/>
-            </w:tcMar>
-          </w:tcPr>
-          <w:p>
-            <w:pPr>
-              <w:spacing w:after="0" w:line="240" w:lineRule="auto"/>
-            </w:pPr>
-            <w:r>
-              <w:rPr>
-                <w:sz w:val="16"/>
-              </w:rPr>
-              <w:t>Not isolated as an independent attack.</w:t>
-            </w:r>
-          </w:p>
-        </w:tc>
-        <w:tc>
-          <w:tcPr>
-            <w:tcW w:type="dxa" w:w="2541"/>
-            <w:vAlign w:val="center"/>
-            <w:tcMar>
-              <w:top w:w="95" w:type="dxa"/>
-              <w:start w:w="105" w:type="dxa"/>
-              <w:bottom w:w="95" w:type="dxa"/>
-              <w:end w:w="105" w:type="dxa"/>
-            </w:tcMar>
-          </w:tcPr>
-          <w:p>
-            <w:pPr>
-              <w:spacing w:after="0" w:line="240" w:lineRule="auto"/>
-            </w:pPr>
-            <w:r>
-              <w:rPr>
-                <w:sz w:val="16"/>
-              </w:rPr>
-              <w:t>REPRESENTATION BOUNDARY - identical executable shape cannot independently encode a different semantic authorized-decision identity.</w:t>
-            </w:r>
-          </w:p>
-        </w:tc>
-        <w:tc>
-          <w:tcPr>
-            <w:tcW w:type="dxa" w:w="2541"/>
-            <w:vAlign w:val="center"/>
-            <w:tcMar>
-              <w:top w:w="95" w:type="dxa"/>
-              <w:start w:w="105" w:type="dxa"/>
-              <w:bottom w:w="95" w:type="dxa"/>
-              <w:end w:w="105" w:type="dxa"/>
-            </w:tcMar>
-          </w:tcPr>
-          <w:p>
-            <w:pPr>
-              <w:spacing w:after="0" w:line="240" w:lineRule="auto"/>
-            </w:pPr>
-            <w:r>
-              <w:rPr>
-                <w:sz w:val="16"/>
-              </w:rPr>
-              <w:t>WOJCIECH-UNIQUE FINDING.</w:t>
-            </w:r>
-          </w:p>
-        </w:tc>
-      </w:tr>
-      <w:tr>
-        <w:trPr>
-          <w:cantSplit/>
-        </w:trPr>
-        <w:tc>
-          <w:tcPr>
-            <w:tcW w:type="dxa" w:w="2541"/>
-            <w:vAlign w:val="center"/>
-            <w:tcMar>
-              <w:top w:w="95" w:type="dxa"/>
-              <w:start w:w="105" w:type="dxa"/>
-              <w:bottom w:w="95" w:type="dxa"/>
-              <w:end w:w="105" w:type="dxa"/>
-            </w:tcMar>
-          </w:tcPr>
-          <w:p>
-            <w:pPr>
-              <w:spacing w:after="0" w:line="240" w:lineRule="auto"/>
-            </w:pPr>
-            <w:r>
-              <w:rPr>
-                <w:b/>
-                <w:sz w:val="16"/>
-              </w:rPr>
-              <w:t>Coverage character</w:t>
-            </w:r>
-          </w:p>
-        </w:tc>
-        <w:tc>
-          <w:tcPr>
-            <w:tcW w:type="dxa" w:w="2541"/>
-            <w:vAlign w:val="center"/>
-            <w:tcMar>
-              <w:top w:w="95" w:type="dxa"/>
-              <w:start w:w="105" w:type="dxa"/>
-              <w:bottom w:w="95" w:type="dxa"/>
-              <w:end w:w="105" w:type="dxa"/>
-            </w:tcMar>
-          </w:tcPr>
-          <w:p>
-            <w:pPr>
-              <w:spacing w:after="0" w:line="240" w:lineRule="auto"/>
-            </w:pPr>
-            <w:r>
-              <w:rPr>
-                <w:sz w:val="16"/>
-              </w:rPr>
-              <w:t>Broad curated browser matrix with all 34 declared categorical options exercised at least once; important disclosed gaps remain.</w:t>
-            </w:r>
-          </w:p>
-        </w:tc>
-        <w:tc>
-          <w:tcPr>
-            <w:tcW w:type="dxa" w:w="2541"/>
-            <w:vAlign w:val="center"/>
-            <w:tcMar>
-              <w:top w:w="95" w:type="dxa"/>
-              <w:start w:w="105" w:type="dxa"/>
-              <w:bottom w:w="95" w:type="dxa"/>
-              <w:end w:w="105" w:type="dxa"/>
-            </w:tcMar>
-          </w:tcPr>
-          <w:p>
-            <w:pPr>
-              <w:spacing w:after="0" w:line="240" w:lineRule="auto"/>
-            </w:pPr>
-            <w:r>
-              <w:rPr>
-                <w:sz w:val="16"/>
-              </w:rPr>
-              <w:t>Attack-oriented conceptual and implementation review continued until no further meaningful V2-only attack remained.</w:t>
-            </w:r>
-          </w:p>
-        </w:tc>
-        <w:tc>
-          <w:tcPr>
-            <w:tcW w:type="dxa" w:w="2541"/>
-            <w:vAlign w:val="center"/>
-            <w:tcMar>
-              <w:top w:w="95" w:type="dxa"/>
-              <w:start w:w="105" w:type="dxa"/>
-              <w:bottom w:w="95" w:type="dxa"/>
-              <w:end w:w="105" w:type="dxa"/>
-            </w:tcMar>
-          </w:tcPr>
-          <w:p>
-            <w:pPr>
-              <w:spacing w:after="0" w:line="240" w:lineRule="auto"/>
-            </w:pPr>
-            <w:r>
-              <w:rPr>
-                <w:sz w:val="16"/>
-              </w:rPr>
-              <w:t>COMPLEMENTARY METHODOLOGIES: Claude supplies breadth; Wojciech supplies depth around authority semantics and representation boundaries.</w:t>
-            </w:r>
-          </w:p>
-        </w:tc>
-      </w:tr>
-    </w:tbl>
-    <w:p>
-      <w:pPr>
-        <w:pStyle w:val="Heading1"/>
-        <w:keepNext/>
-      </w:pPr>
-      <w:r>
-        <w:t>4. What Both Reviews Independently Support</w:t>
-      </w:r>
-    </w:p>
-    <w:p>
-      <w:pPr>
-        <w:pStyle w:val="Heading2"/>
-        <w:keepNext/>
-      </w:pPr>
-      <w:r>
-        <w:t>4.1 The enforceable boundary is not decorative</w:t>
-      </w:r>
-    </w:p>
-    <w:p>
-      <w:r>
-        <w:t>Both review paths support the proposition that the enforceable boundary performs causal work at execution. Claude observed outcome changes when boundary membership or conditions changed. Wojciech independently attacked whether the boundary merely reproduced an upstream governance decision and concluded that it was causally operative.</w:t>
-      </w:r>
-    </w:p>
-    <w:p>
-      <w:pPr>
-        <w:pStyle w:val="Heading2"/>
-        <w:keepNext/>
-      </w:pPr>
-      <w:r>
-        <w:t>4.2 V2 did not reveal a zero-authority execution bypass in the tested ordinary paths</w:t>
-      </w:r>
-    </w:p>
-    <w:p>
-      <w:r>
-        <w:t>Claude found no tested ALLOW with zero underlying executable authority. Wojciech independently confirmed the boundary-creation rule: non-ACTIVE authority cannot create a new executable boundary.</w:t>
-      </w:r>
-    </w:p>
-    <w:p>
-      <w:pPr>
-        <w:pStyle w:val="Heading2"/>
-        <w:keepNext/>
-      </w:pPr>
-      <w:r>
-        <w:t>4.3 Correct enforcement is not the same as correct organizational authority</w:t>
-      </w:r>
-    </w:p>
-    <w:p>
-      <w:r>
-        <w:t>Claude's Procurement finding and Wojciech's known-limit classification converge on a deeper distinction: a system can enforce a boundary correctly while the organization has defined the wrong boundary or wrong governed quantity.</w:t>
-      </w:r>
-    </w:p>
-    <w:p>
-      <w:pPr>
-        <w:pStyle w:val="Heading2"/>
-        <w:keepNext/>
-      </w:pPr>
-      <w:r>
-        <w:t>4.4 Outcome accuracy alone is not sufficient</w:t>
-      </w:r>
-    </w:p>
-    <w:p>
-      <w:r>
-        <w:t>Claude F-1 demonstrates that a safe final BLOCK can still carry an incorrect causal narrative. Wojciech's review independently treated mechanism and explanation as part of the evaluation rather than accepting aggregate ALLOW/BLOCK accuracy as enough.</w:t>
-      </w:r>
-    </w:p>
-    <w:p>
-      <w:pPr>
-        <w:pStyle w:val="Heading1"/>
-        <w:keepNext/>
-      </w:pPr>
-      <w:r>
-        <w:t>5. Findings That Should Not Be Collapsed</w:t>
-      </w:r>
-    </w:p>
-    <w:p>
-      <w:pPr>
-        <w:pStyle w:val="Heading2"/>
-        <w:keepNext/>
-      </w:pPr>
-      <w:r>
-        <w:t>5.1 Claude ACCESS anomaly vs. Wojciech temporal continuity</w:t>
-      </w:r>
-    </w:p>
-    <w:p>
-      <w:r>
-        <w:t>Claude observed one order/history anomaly that did not survive controlled reproduction. It remains REVIEW REQUIRED / not reproduced. Wojciech's temporal finding is different: V2 lacks a represented t0 -&gt; t1 -&gt; t2 trajectory in which a valid boundary persists after its source authority becomes stale. The Claude anomaly should not be promoted into proof of Wojciech's temporal gap, and Wojciech's gap should not be reduced to Claude's client-state symptom.</w:t>
-      </w:r>
-    </w:p>
-    <w:p>
-      <w:pPr>
-        <w:pStyle w:val="Heading2"/>
-        <w:keepNext/>
-      </w:pPr>
-      <w:r>
-        <w:t>5.2 Claude F-1 vs. Wojciech BLOCK-reason survival</w:t>
-      </w:r>
-    </w:p>
-    <w:p>
-      <w:r>
-        <w:t>These are not contradictory. Wojciech shows that V2 has representational capacity for distinct BLOCK causes. Claude F-1 suggests that a particular implementation path can nevertheless populate the evidence trail with the wrong causal object or explanation. The combined interpretation is stronger than either alone.</w:t>
-      </w:r>
-    </w:p>
-    <w:p>
-      <w:pPr>
-        <w:pStyle w:val="Heading2"/>
-        <w:keepNext/>
-      </w:pPr>
-      <w:r>
-        <w:t>5.3 Temporal continuity vs. governing provenance</w:t>
-      </w:r>
-    </w:p>
-    <w:p>
-      <w:r>
-        <w:t>Wojciech deliberately keeps these separate. Temporal continuity asks whether legitimately created authority remains current over time. Governing provenance asks whether the legitimacy of recorded lineage can independently matter at execution after boundary creation. Both meet at the post-boundary architectural boundary, but they are distinct questions.</w:t>
-      </w:r>
-    </w:p>
-    <w:p>
-      <w:pPr>
-        <w:pStyle w:val="Heading1"/>
-        <w:keepNext/>
-      </w:pPr>
-      <w:r>
-        <w:t>6. Review-Basis Correction and Preserved Qualifications</w:t>
-      </w:r>
-    </w:p>
-    <w:p>
-      <w:r>
-        <w:t>A raw-thread-to-final-assessment audit performed after the first cross-review confirmed that Wojciech's nine frozen classifications were accurately preserved, but identified additional context that needed to be explicit in the canonical synthesis. This corrected cross-review incorporates that context without changing any of Wojciech's frozen classifications.</w:t>
-      </w:r>
-    </w:p>
-    <w:p>
-      <w:pPr>
-        <w:pStyle w:val="ListBullet"/>
-      </w:pPr>
-      <w:r>
-        <w:t>Governing-provenance qualification: Wojciech did not conclude that normal governed V2 runs routinely produce illegitimate lineage. He explicitly noted that the governed pipeline performs important legitimacy work upstream and may prevent such a boundary from being constructed through the normal path. The execution-layer discrimination limit therefore remains a representation boundary, not evidence of ordinary-path failure.</w:t>
-      </w:r>
-    </w:p>
-    <w:p>
-      <w:pPr>
-        <w:pStyle w:val="ListBullet"/>
-      </w:pPr>
-      <w:r>
-        <w:t>Attack-to-result traceability: the corrected Wojciech assessment now maps the original and closing attack agenda to their final dispositions, including attacks that survived, narrowed, collapsed into another finding, or reached a representation boundary.</w:t>
-      </w:r>
-    </w:p>
-    <w:p>
-      <w:pPr>
-        <w:pStyle w:val="ListBullet"/>
-      </w:pPr>
-      <w:r>
-        <w:t>Explicitly parked upstream research: authority-to-authorize/actor standing, recursion termination, possible trust anchors, and authority continuity/termination were consciously kept outside the frozen V2 findings. Their presence in the raw exchange must not be mistaken either for omissions in thinking or for approved future architecture.</w:t>
-      </w:r>
-    </w:p>
-    <w:p>
-      <w:pPr>
-        <w:pStyle w:val="Heading1"/>
-        <w:keepNext/>
-      </w:pPr>
-      <w:r>
-        <w:t>7. Current Adjudication by Finding</w:t>
-      </w:r>
-    </w:p>
-    <w:tbl>
-      <w:tblPr>
-        <w:tblStyle w:val="TableGrid"/>
-        <w:tblW w:type="auto" w:w="0"/>
-        <w:jc w:val="center"/>
-        <w:tblLook w:firstColumn="1" w:firstRow="1" w:lastColumn="0" w:lastRow="0" w:noHBand="0" w:noVBand="1" w:val="04A0"/>
-      </w:tblPr>
-      <w:tblGrid>
-        <w:gridCol w:w="3389"/>
-        <w:gridCol w:w="3389"/>
-        <w:gridCol w:w="3389"/>
-      </w:tblGrid>
-      <w:tr>
-        <w:trPr>
-          <w:tblHeader w:val="true"/>
-        </w:trPr>
-        <w:tc>
-          <w:tcPr>
-            <w:tcW w:type="dxa" w:w="3389"/>
-            <w:shd w:fill="375623"/>
-            <w:tcMar>
-              <w:top w:w="100" w:type="dxa"/>
-              <w:start w:w="120" w:type="dxa"/>
-              <w:bottom w:w="100" w:type="dxa"/>
-              <w:end w:w="120" w:type="dxa"/>
-            </w:tcMar>
-          </w:tcPr>
-          <w:p>
-            <w:r>
-              <w:rPr>
-                <w:b/>
-                <w:color w:val="FFFFFF"/>
-                <w:sz w:val="18"/>
-              </w:rPr>
-              <w:t>Item</w:t>
-            </w:r>
-          </w:p>
-        </w:tc>
-        <w:tc>
-          <w:tcPr>
-            <w:tcW w:type="dxa" w:w="3389"/>
-            <w:shd w:fill="375623"/>
-            <w:tcMar>
-              <w:top w:w="100" w:type="dxa"/>
-              <w:start w:w="120" w:type="dxa"/>
-              <w:bottom w:w="100" w:type="dxa"/>
-              <w:end w:w="120" w:type="dxa"/>
-            </w:tcMar>
-          </w:tcPr>
-          <w:p>
-            <w:r>
-              <w:rPr>
-                <w:b/>
-                <w:color w:val="FFFFFF"/>
-                <w:sz w:val="18"/>
-              </w:rPr>
-              <w:t>Current classification</w:t>
-            </w:r>
-          </w:p>
-        </w:tc>
-        <w:tc>
-          <w:tcPr>
-            <w:tcW w:type="dxa" w:w="3389"/>
-            <w:shd w:fill="375623"/>
-            <w:tcMar>
-              <w:top w:w="100" w:type="dxa"/>
-              <w:start w:w="120" w:type="dxa"/>
-              <w:bottom w:w="100" w:type="dxa"/>
-              <w:end w:w="120" w:type="dxa"/>
-            </w:tcMar>
-          </w:tcPr>
-          <w:p>
-            <w:r>
-              <w:rPr>
-                <w:b/>
-                <w:color w:val="FFFFFF"/>
-                <w:sz w:val="18"/>
-              </w:rPr>
-              <w:t>Rationale</w:t>
-            </w:r>
-          </w:p>
-        </w:tc>
-      </w:tr>
-      <w:tr>
-        <w:trPr>
-          <w:cantSplit/>
-        </w:trPr>
-        <w:tc>
-          <w:tcPr>
-            <w:tcW w:type="dxa" w:w="3389"/>
-            <w:tcMar>
-              <w:top w:w="95" w:type="dxa"/>
-              <w:start w:w="105" w:type="dxa"/>
-              <w:bottom w:w="95" w:type="dxa"/>
-              <w:end w:w="105" w:type="dxa"/>
-            </w:tcMar>
-            <w:vAlign w:val="center"/>
-          </w:tcPr>
-          <w:p>
-            <w:pPr>
-              <w:spacing w:after="0" w:line="240" w:lineRule="auto"/>
-            </w:pPr>
-            <w:r>
-              <w:rPr>
-                <w:b/>
-                <w:sz w:val="17"/>
-              </w:rPr>
-              <w:t>V2 CENTRAL HYPOTHESIS</w:t>
-            </w:r>
-          </w:p>
-        </w:tc>
-        <w:tc>
-          <w:tcPr>
-            <w:tcW w:type="dxa" w:w="3389"/>
-            <w:tcMar>
-              <w:top w:w="95" w:type="dxa"/>
-              <w:start w:w="105" w:type="dxa"/>
-              <w:bottom w:w="95" w:type="dxa"/>
-              <w:end w:w="105" w:type="dxa"/>
-            </w:tcMar>
-            <w:vAlign w:val="center"/>
-          </w:tcPr>
-          <w:p>
-            <w:pPr>
-              <w:spacing w:after="0" w:line="240" w:lineRule="auto"/>
-            </w:pPr>
-            <w:r>
-              <w:rPr>
-                <w:sz w:val="17"/>
-              </w:rPr>
-              <w:t>SURVIVES within represented/tested scope</w:t>
-            </w:r>
-          </w:p>
-        </w:tc>
-        <w:tc>
-          <w:tcPr>
-            <w:tcW w:type="dxa" w:w="3389"/>
-            <w:tcMar>
-              <w:top w:w="95" w:type="dxa"/>
-              <w:start w:w="105" w:type="dxa"/>
-              <w:bottom w:w="95" w:type="dxa"/>
-              <w:end w:w="105" w:type="dxa"/>
-            </w:tcMar>
-            <w:vAlign w:val="center"/>
-          </w:tcPr>
-          <w:p>
-            <w:pPr>
-              <w:spacing w:after="0" w:line="240" w:lineRule="auto"/>
-            </w:pPr>
-            <w:r>
-              <w:rPr>
-                <w:sz w:val="17"/>
-              </w:rPr>
-              <w:t>Neither independent review demonstrated that the enforceable boundary is merely ceremonial or routinely bypassed. V2 demonstrates causal enforcement of a represented current operative boundary.</w:t>
-            </w:r>
-          </w:p>
-        </w:tc>
-      </w:tr>
-      <w:tr>
-        <w:trPr>
-          <w:cantSplit/>
-        </w:trPr>
-        <w:tc>
-          <w:tcPr>
-            <w:tcW w:type="dxa" w:w="3389"/>
-            <w:tcMar>
-              <w:top w:w="95" w:type="dxa"/>
-              <w:start w:w="105" w:type="dxa"/>
-              <w:bottom w:w="95" w:type="dxa"/>
-              <w:end w:w="105" w:type="dxa"/>
-            </w:tcMar>
-            <w:vAlign w:val="center"/>
-          </w:tcPr>
-          <w:p>
-            <w:pPr>
-              <w:spacing w:after="0" w:line="240" w:lineRule="auto"/>
-            </w:pPr>
-            <w:r>
-              <w:rPr>
-                <w:b/>
-                <w:sz w:val="17"/>
-              </w:rPr>
-              <w:t>CLAUDE F-1 - REFUND TRANSFER empty owner</w:t>
-            </w:r>
-          </w:p>
-        </w:tc>
-        <w:tc>
-          <w:tcPr>
-            <w:tcW w:type="dxa" w:w="3389"/>
-            <w:tcMar>
-              <w:top w:w="95" w:type="dxa"/>
-              <w:start w:w="105" w:type="dxa"/>
-              <w:bottom w:w="95" w:type="dxa"/>
-              <w:end w:w="105" w:type="dxa"/>
-            </w:tcMar>
-            <w:vAlign w:val="center"/>
-          </w:tcPr>
-          <w:p>
-            <w:pPr>
-              <w:spacing w:after="0" w:line="240" w:lineRule="auto"/>
-            </w:pPr>
-            <w:r>
-              <w:rPr>
-                <w:sz w:val="17"/>
-              </w:rPr>
-              <w:t>PROBABLE IMPLEMENTATION / EVIDENCE-INTEGRITY DEFECT</w:t>
-            </w:r>
-          </w:p>
-        </w:tc>
-        <w:tc>
-          <w:tcPr>
-            <w:tcW w:type="dxa" w:w="3389"/>
-            <w:tcMar>
-              <w:top w:w="95" w:type="dxa"/>
-              <w:start w:w="105" w:type="dxa"/>
-              <w:bottom w:w="95" w:type="dxa"/>
-              <w:end w:w="105" w:type="dxa"/>
-            </w:tcMar>
-            <w:vAlign w:val="center"/>
-          </w:tcPr>
-          <w:p>
-            <w:pPr>
-              <w:spacing w:after="0" w:line="240" w:lineRule="auto"/>
-            </w:pPr>
-            <w:r>
-              <w:rPr>
-                <w:sz w:val="17"/>
-              </w:rPr>
-              <w:t>A safe BLOCK with a false authority/materiality narrative is material in an evidence-producing research instrument. Reproduction and source adjudication are still required before remediation.</w:t>
-            </w:r>
-          </w:p>
-        </w:tc>
-      </w:tr>
-      <w:tr>
-        <w:trPr>
-          <w:cantSplit/>
-        </w:trPr>
-        <w:tc>
-          <w:tcPr>
-            <w:tcW w:type="dxa" w:w="3389"/>
-            <w:tcMar>
-              <w:top w:w="95" w:type="dxa"/>
-              <w:start w:w="105" w:type="dxa"/>
-              <w:bottom w:w="95" w:type="dxa"/>
-              <w:end w:w="105" w:type="dxa"/>
-            </w:tcMar>
-            <w:vAlign w:val="center"/>
-          </w:tcPr>
-          <w:p>
-            <w:pPr>
-              <w:spacing w:after="0" w:line="240" w:lineRule="auto"/>
-            </w:pPr>
-            <w:r>
-              <w:rPr>
-                <w:b/>
-                <w:sz w:val="17"/>
-              </w:rPr>
-              <w:t>CLAUDE F-2 - PROCUREMENT NARROW governed metric</w:t>
-            </w:r>
-          </w:p>
-        </w:tc>
-        <w:tc>
-          <w:tcPr>
-            <w:tcW w:type="dxa" w:w="3389"/>
-            <w:tcMar>
-              <w:top w:w="95" w:type="dxa"/>
-              <w:start w:w="105" w:type="dxa"/>
-              <w:bottom w:w="95" w:type="dxa"/>
-              <w:end w:w="105" w:type="dxa"/>
-            </w:tcMar>
-            <w:vAlign w:val="center"/>
-          </w:tcPr>
-          <w:p>
-            <w:pPr>
-              <w:spacing w:after="0" w:line="240" w:lineRule="auto"/>
-            </w:pPr>
-            <w:r>
-              <w:rPr>
-                <w:sz w:val="17"/>
-              </w:rPr>
-              <w:t>SPECIFICATION / EXPERIMENTAL-SEMANTICS QUESTION; NOT YET ADJUDICATED AS IMPLEMENTATION DEFECT</w:t>
-            </w:r>
-          </w:p>
-        </w:tc>
-        <w:tc>
-          <w:tcPr>
-            <w:tcW w:type="dxa" w:w="3389"/>
-            <w:tcMar>
-              <w:top w:w="95" w:type="dxa"/>
-              <w:start w:w="105" w:type="dxa"/>
-              <w:bottom w:w="95" w:type="dxa"/>
-              <w:end w:w="105" w:type="dxa"/>
-            </w:tcMar>
-            <w:vAlign w:val="center"/>
-          </w:tcPr>
-          <w:p>
-            <w:pPr>
-              <w:spacing w:after="0" w:line="240" w:lineRule="auto"/>
-            </w:pPr>
-            <w:r>
-              <w:rPr>
-                <w:sz w:val="17"/>
-              </w:rPr>
-              <w:t>The key question is what NARROW was intended to mean: narrow the currently selected governed metric, or narrow the old equipment-price authority while RENEW changes the governed basis. The governing specification must decide the oracle.</w:t>
-            </w:r>
-          </w:p>
-        </w:tc>
-      </w:tr>
-      <w:tr>
-        <w:trPr>
-          <w:cantSplit/>
-        </w:trPr>
-        <w:tc>
-          <w:tcPr>
-            <w:tcW w:type="dxa" w:w="3389"/>
-            <w:tcMar>
-              <w:top w:w="95" w:type="dxa"/>
-              <w:start w:w="105" w:type="dxa"/>
-              <w:bottom w:w="95" w:type="dxa"/>
-              <w:end w:w="105" w:type="dxa"/>
-            </w:tcMar>
-            <w:vAlign w:val="center"/>
-          </w:tcPr>
-          <w:p>
-            <w:pPr>
-              <w:spacing w:after="0" w:line="240" w:lineRule="auto"/>
-            </w:pPr>
-            <w:r>
-              <w:rPr>
-                <w:b/>
-                <w:sz w:val="17"/>
-              </w:rPr>
-              <w:t>CLAUDE ACCESS order/history anomaly</w:t>
-            </w:r>
-          </w:p>
-        </w:tc>
-        <w:tc>
-          <w:tcPr>
-            <w:tcW w:type="dxa" w:w="3389"/>
-            <w:tcMar>
-              <w:top w:w="95" w:type="dxa"/>
-              <w:start w:w="105" w:type="dxa"/>
-              <w:bottom w:w="95" w:type="dxa"/>
-              <w:end w:w="105" w:type="dxa"/>
-            </w:tcMar>
-            <w:vAlign w:val="center"/>
-          </w:tcPr>
-          <w:p>
-            <w:pPr>
-              <w:spacing w:after="0" w:line="240" w:lineRule="auto"/>
-            </w:pPr>
-            <w:r>
-              <w:rPr>
-                <w:sz w:val="17"/>
-              </w:rPr>
-              <w:t>NOT REPRODUCED / REVIEW REQUIRED</w:t>
-            </w:r>
-          </w:p>
-        </w:tc>
-        <w:tc>
-          <w:tcPr>
-            <w:tcW w:type="dxa" w:w="3389"/>
-            <w:tcMar>
-              <w:top w:w="95" w:type="dxa"/>
-              <w:start w:w="105" w:type="dxa"/>
-              <w:bottom w:w="95" w:type="dxa"/>
-              <w:end w:w="105" w:type="dxa"/>
-            </w:tcMar>
-            <w:vAlign w:val="center"/>
-          </w:tcPr>
-          <w:p>
-            <w:pPr>
-              <w:spacing w:after="0" w:line="240" w:lineRule="auto"/>
-            </w:pPr>
-            <w:r>
-              <w:rPr>
-                <w:sz w:val="17"/>
-              </w:rPr>
-              <w:t>Preserve the observation. Do not convert it into a confirmed temporal defect.</w:t>
-            </w:r>
-          </w:p>
-        </w:tc>
-      </w:tr>
-      <w:tr>
-        <w:trPr>
-          <w:cantSplit/>
-        </w:trPr>
-        <w:tc>
-          <w:tcPr>
-            <w:tcW w:type="dxa" w:w="3389"/>
-            <w:tcMar>
-              <w:top w:w="95" w:type="dxa"/>
-              <w:start w:w="105" w:type="dxa"/>
-              <w:bottom w:w="95" w:type="dxa"/>
-              <w:end w:w="105" w:type="dxa"/>
-            </w:tcMar>
-            <w:vAlign w:val="center"/>
-          </w:tcPr>
-          <w:p>
-            <w:pPr>
-              <w:spacing w:after="0" w:line="240" w:lineRule="auto"/>
-            </w:pPr>
-            <w:r>
-              <w:rPr>
-                <w:b/>
-                <w:sz w:val="17"/>
-              </w:rPr>
-              <w:t>WOJCIECH temporal continuity</w:t>
-            </w:r>
-          </w:p>
-        </w:tc>
-        <w:tc>
-          <w:tcPr>
-            <w:tcW w:type="dxa" w:w="3389"/>
-            <w:tcMar>
-              <w:top w:w="95" w:type="dxa"/>
-              <w:start w:w="105" w:type="dxa"/>
-              <w:bottom w:w="95" w:type="dxa"/>
-              <w:end w:w="105" w:type="dxa"/>
-            </w:tcMar>
-            <w:vAlign w:val="center"/>
-          </w:tcPr>
-          <w:p>
-            <w:pPr>
-              <w:spacing w:after="0" w:line="240" w:lineRule="auto"/>
-            </w:pPr>
-            <w:r>
-              <w:rPr>
-                <w:sz w:val="17"/>
-              </w:rPr>
-              <w:t>MODEL / REPRESENTATION LIMITATION + RESEARCH QUESTION</w:t>
-            </w:r>
-          </w:p>
-        </w:tc>
-        <w:tc>
-          <w:tcPr>
-            <w:tcW w:type="dxa" w:w="3389"/>
-            <w:tcMar>
-              <w:top w:w="95" w:type="dxa"/>
-              <w:start w:w="105" w:type="dxa"/>
-              <w:bottom w:w="95" w:type="dxa"/>
-              <w:end w:w="105" w:type="dxa"/>
-            </w:tcMar>
-            <w:vAlign w:val="center"/>
-          </w:tcPr>
-          <w:p>
-            <w:pPr>
-              <w:spacing w:after="0" w:line="240" w:lineRule="auto"/>
-            </w:pPr>
-            <w:r>
-              <w:rPr>
-                <w:sz w:val="17"/>
-              </w:rPr>
-              <w:t>V2 does not represent continuing authority validity after valid boundary creation across a later independent state transition.</w:t>
-            </w:r>
-          </w:p>
-        </w:tc>
-      </w:tr>
-      <w:tr>
-        <w:trPr>
-          <w:cantSplit/>
-        </w:trPr>
-        <w:tc>
-          <w:tcPr>
-            <w:tcW w:type="dxa" w:w="3389"/>
-            <w:tcMar>
-              <w:top w:w="95" w:type="dxa"/>
-              <w:start w:w="105" w:type="dxa"/>
-              <w:bottom w:w="95" w:type="dxa"/>
-              <w:end w:w="105" w:type="dxa"/>
-            </w:tcMar>
-            <w:vAlign w:val="center"/>
-          </w:tcPr>
-          <w:p>
-            <w:pPr>
-              <w:spacing w:after="0" w:line="240" w:lineRule="auto"/>
-            </w:pPr>
-            <w:r>
-              <w:rPr>
-                <w:b/>
-                <w:sz w:val="17"/>
-              </w:rPr>
-              <w:t>WOJCIECH governing provenance</w:t>
-            </w:r>
-          </w:p>
-        </w:tc>
-        <w:tc>
-          <w:tcPr>
-            <w:tcW w:type="dxa" w:w="3389"/>
-            <w:tcMar>
-              <w:top w:w="95" w:type="dxa"/>
-              <w:start w:w="105" w:type="dxa"/>
-              <w:bottom w:w="95" w:type="dxa"/>
-              <w:end w:w="105" w:type="dxa"/>
-            </w:tcMar>
-            <w:vAlign w:val="center"/>
-          </w:tcPr>
-          <w:p>
-            <w:pPr>
-              <w:spacing w:after="0" w:line="240" w:lineRule="auto"/>
-            </w:pPr>
-            <w:r>
-              <w:rPr>
-                <w:sz w:val="17"/>
-              </w:rPr>
-              <w:t>MODEL / REPRESENTATION LIMITATION + RESEARCH QUESTION</w:t>
-            </w:r>
-          </w:p>
-        </w:tc>
-        <w:tc>
-          <w:tcPr>
-            <w:tcW w:type="dxa" w:w="3389"/>
-            <w:tcMar>
-              <w:top w:w="95" w:type="dxa"/>
-              <w:start w:w="105" w:type="dxa"/>
-              <w:bottom w:w="95" w:type="dxa"/>
-              <w:end w:w="105" w:type="dxa"/>
-            </w:tcMar>
-            <w:vAlign w:val="center"/>
-          </w:tcPr>
-          <w:p>
-            <w:pPr>
-              <w:spacing w:after="0" w:line="240" w:lineRule="auto"/>
-            </w:pPr>
-            <w:r>
-              <w:rPr>
-                <w:sz w:val="17"/>
-              </w:rPr>
-              <w:t>V2 preserves lineage as evidence but does not independently consume lineage legitimacy as an execution predicate after boundary creation. This execution-layer limit is not evidence that the normal governed pipeline routinely constructs illegitimate lineage; Wojciech explicitly noted that upstream pipeline logic may prevent that condition in ordinary governed runs.</w:t>
-            </w:r>
-          </w:p>
-        </w:tc>
-      </w:tr>
-      <w:tr>
-        <w:trPr>
-          <w:cantSplit/>
-        </w:trPr>
-        <w:tc>
-          <w:tcPr>
-            <w:tcW w:type="dxa" w:w="3389"/>
-            <w:tcMar>
-              <w:top w:w="95" w:type="dxa"/>
-              <w:start w:w="105" w:type="dxa"/>
-              <w:bottom w:w="95" w:type="dxa"/>
-              <w:end w:w="105" w:type="dxa"/>
-            </w:tcMar>
-            <w:vAlign w:val="center"/>
-          </w:tcPr>
-          <w:p>
-            <w:pPr>
-              <w:spacing w:after="0" w:line="240" w:lineRule="auto"/>
-            </w:pPr>
-            <w:r>
-              <w:rPr>
-                <w:b/>
-                <w:sz w:val="17"/>
-              </w:rPr>
-              <w:t>WOJCIECH replay result</w:t>
-            </w:r>
-          </w:p>
-        </w:tc>
-        <w:tc>
-          <w:tcPr>
-            <w:tcW w:type="dxa" w:w="3389"/>
-            <w:tcMar>
-              <w:top w:w="95" w:type="dxa"/>
-              <w:start w:w="105" w:type="dxa"/>
-              <w:bottom w:w="95" w:type="dxa"/>
-              <w:end w:w="105" w:type="dxa"/>
-            </w:tcMar>
-            <w:vAlign w:val="center"/>
-          </w:tcPr>
-          <w:p>
-            <w:pPr>
-              <w:spacing w:after="0" w:line="240" w:lineRule="auto"/>
-            </w:pPr>
-            <w:r>
-              <w:rPr>
-                <w:sz w:val="17"/>
-              </w:rPr>
-              <w:t>GOVERNED REPLAY SURVIVES; ARTIFACT EPOCH-BINDING REMAINS OUTSIDE CURRENT REPRESENTATION</w:t>
-            </w:r>
-          </w:p>
-        </w:tc>
-        <w:tc>
-          <w:tcPr>
-            <w:tcW w:type="dxa" w:w="3389"/>
-            <w:tcMar>
-              <w:top w:w="95" w:type="dxa"/>
-              <w:start w:w="105" w:type="dxa"/>
-              <w:bottom w:w="95" w:type="dxa"/>
-              <w:end w:w="105" w:type="dxa"/>
-            </w:tcMar>
-            <w:vAlign w:val="center"/>
-          </w:tcPr>
-          <w:p>
-            <w:pPr>
-              <w:spacing w:after="0" w:line="240" w:lineRule="auto"/>
-            </w:pPr>
-            <w:r>
-              <w:rPr>
-                <w:sz w:val="17"/>
-              </w:rPr>
-              <w:t>Replay regenerates the chain; the boundary artifact itself is not independently run/epoch-bound at execution.</w:t>
-            </w:r>
-          </w:p>
-        </w:tc>
-      </w:tr>
-      <w:tr>
-        <w:trPr>
-          <w:cantSplit/>
-        </w:trPr>
-        <w:tc>
-          <w:tcPr>
-            <w:tcW w:type="dxa" w:w="3389"/>
-            <w:tcMar>
-              <w:top w:w="95" w:type="dxa"/>
-              <w:start w:w="105" w:type="dxa"/>
-              <w:bottom w:w="95" w:type="dxa"/>
-              <w:end w:w="105" w:type="dxa"/>
-            </w:tcMar>
-            <w:vAlign w:val="center"/>
-          </w:tcPr>
-          <w:p>
-            <w:pPr>
-              <w:spacing w:after="0" w:line="240" w:lineRule="auto"/>
-            </w:pPr>
-            <w:r>
-              <w:rPr>
-                <w:b/>
-                <w:sz w:val="17"/>
-              </w:rPr>
-              <w:t>WOJCIECH semantic decision-object identity</w:t>
-            </w:r>
-          </w:p>
-        </w:tc>
-        <w:tc>
-          <w:tcPr>
-            <w:tcW w:type="dxa" w:w="3389"/>
-            <w:tcMar>
-              <w:top w:w="95" w:type="dxa"/>
-              <w:start w:w="105" w:type="dxa"/>
-              <w:bottom w:w="95" w:type="dxa"/>
-              <w:end w:w="105" w:type="dxa"/>
-            </w:tcMar>
-            <w:vAlign w:val="center"/>
-          </w:tcPr>
-          <w:p>
-            <w:pPr>
-              <w:spacing w:after="0" w:line="240" w:lineRule="auto"/>
-            </w:pPr>
-            <w:r>
-              <w:rPr>
-                <w:sz w:val="17"/>
-              </w:rPr>
-              <w:t>REPRESENTATION BOUNDARY</w:t>
-            </w:r>
-          </w:p>
-        </w:tc>
-        <w:tc>
-          <w:tcPr>
-            <w:tcW w:type="dxa" w:w="3389"/>
-            <w:tcMar>
-              <w:top w:w="95" w:type="dxa"/>
-              <w:start w:w="105" w:type="dxa"/>
-              <w:bottom w:w="95" w:type="dxa"/>
-              <w:end w:w="105" w:type="dxa"/>
-            </w:tcMar>
-            <w:vAlign w:val="center"/>
-          </w:tcPr>
-          <w:p>
-            <w:pPr>
-              <w:spacing w:after="0" w:line="240" w:lineRule="auto"/>
-            </w:pPr>
-            <w:r>
-              <w:rPr>
-                <w:sz w:val="17"/>
-              </w:rPr>
-              <w:t>V2 has no separate execution-level semantic identity variable beyond action, scope and enforceable conditions.</w:t>
-            </w:r>
-          </w:p>
-        </w:tc>
-      </w:tr>
-      <w:tr>
-        <w:trPr>
-          <w:cantSplit/>
-        </w:trPr>
-        <w:tc>
-          <w:tcPr>
-            <w:tcW w:type="dxa" w:w="3389"/>
-            <w:tcMar>
-              <w:top w:w="95" w:type="dxa"/>
-              <w:start w:w="105" w:type="dxa"/>
-              <w:bottom w:w="95" w:type="dxa"/>
-              <w:end w:w="105" w:type="dxa"/>
-            </w:tcMar>
-            <w:vAlign w:val="center"/>
-          </w:tcPr>
-          <w:p>
-            <w:pPr>
-              <w:spacing w:after="0" w:line="240" w:lineRule="auto"/>
-            </w:pPr>
-            <w:r>
-              <w:rPr>
-                <w:b/>
-                <w:sz w:val="17"/>
-              </w:rPr>
-              <w:t>Wrong organizational boundary</w:t>
-            </w:r>
-          </w:p>
-        </w:tc>
-        <w:tc>
-          <w:tcPr>
-            <w:tcW w:type="dxa" w:w="3389"/>
-            <w:tcMar>
-              <w:top w:w="95" w:type="dxa"/>
-              <w:start w:w="105" w:type="dxa"/>
-              <w:bottom w:w="95" w:type="dxa"/>
-              <w:end w:w="105" w:type="dxa"/>
-            </w:tcMar>
-            <w:vAlign w:val="center"/>
-          </w:tcPr>
-          <w:p>
-            <w:pPr>
-              <w:spacing w:after="0" w:line="240" w:lineRule="auto"/>
-            </w:pPr>
-            <w:r>
-              <w:rPr>
-                <w:sz w:val="17"/>
-              </w:rPr>
-              <w:t>KNOWN LIMIT</w:t>
-            </w:r>
-          </w:p>
-        </w:tc>
-        <w:tc>
-          <w:tcPr>
-            <w:tcW w:type="dxa" w:w="3389"/>
-            <w:tcMar>
-              <w:top w:w="95" w:type="dxa"/>
-              <w:start w:w="105" w:type="dxa"/>
-              <w:bottom w:w="95" w:type="dxa"/>
-              <w:end w:w="105" w:type="dxa"/>
-            </w:tcMar>
-            <w:vAlign w:val="center"/>
-          </w:tcPr>
-          <w:p>
-            <w:pPr>
-              <w:spacing w:after="0" w:line="240" w:lineRule="auto"/>
-            </w:pPr>
-            <w:r>
-              <w:rPr>
-                <w:sz w:val="17"/>
-              </w:rPr>
-              <w:t>Correct enforcement cannot establish that the organization selected the correct authority boundary or governed quantity.</w:t>
-            </w:r>
-          </w:p>
-        </w:tc>
-      </w:tr>
-      <w:tr>
-        <w:trPr>
-          <w:cantSplit/>
-        </w:trPr>
-        <w:tc>
-          <w:tcPr>
-            <w:tcW w:type="dxa" w:w="3389"/>
-            <w:tcMar>
-              <w:top w:w="95" w:type="dxa"/>
-              <w:start w:w="105" w:type="dxa"/>
-              <w:bottom w:w="95" w:type="dxa"/>
-              <w:end w:w="105" w:type="dxa"/>
-            </w:tcMar>
-            <w:vAlign w:val="center"/>
-          </w:tcPr>
-          <w:p>
-            <w:pPr>
-              <w:spacing w:after="0" w:line="240" w:lineRule="auto"/>
-            </w:pPr>
-            <w:r>
-              <w:rPr>
-                <w:b/>
-                <w:sz w:val="17"/>
-              </w:rPr>
-              <w:t>Claude final coverage</w:t>
-            </w:r>
-          </w:p>
-        </w:tc>
-        <w:tc>
-          <w:tcPr>
-            <w:tcW w:type="dxa" w:w="3389"/>
-            <w:tcMar>
-              <w:top w:w="95" w:type="dxa"/>
-              <w:start w:w="105" w:type="dxa"/>
-              <w:bottom w:w="95" w:type="dxa"/>
-              <w:end w:w="105" w:type="dxa"/>
-            </w:tcMar>
-            <w:vAlign w:val="center"/>
-          </w:tcPr>
-          <w:p>
-            <w:pPr>
-              <w:spacing w:after="0" w:line="240" w:lineRule="auto"/>
-            </w:pPr>
-            <w:r>
-              <w:rPr>
-                <w:sz w:val="17"/>
-              </w:rPr>
-              <w:t>COVERAGE LIMITATION</w:t>
-            </w:r>
-          </w:p>
-        </w:tc>
-        <w:tc>
-          <w:tcPr>
-            <w:tcW w:type="dxa" w:w="3389"/>
-            <w:tcMar>
-              <w:top w:w="95" w:type="dxa"/>
-              <w:start w:w="105" w:type="dxa"/>
-              <w:bottom w:w="95" w:type="dxa"/>
-              <w:end w:w="105" w:type="dxa"/>
-            </w:tcMar>
-            <w:vAlign w:val="center"/>
-          </w:tcPr>
-          <w:p>
-            <w:pPr>
-              <w:spacing w:after="0" w:line="240" w:lineRule="auto"/>
-            </w:pPr>
-            <w:r>
-              <w:rPr>
-                <w:sz w:val="17"/>
-              </w:rPr>
-              <w:t>Strong curated adversarial review, not literal exhaustive Cartesian validation. Replay, ordered transition, import/export and Procurement numeric-sweep gaps remain disclosed.</w:t>
-            </w:r>
-          </w:p>
-        </w:tc>
-      </w:tr>
-    </w:tbl>
-    <w:p>
-      <w:pPr>
-        <w:pStyle w:val="Heading1"/>
-        <w:keepNext/>
-      </w:pPr>
-      <w:r>
-        <w:t>8. Sharpened V2 Claim Boundary</w:t>
-      </w:r>
-    </w:p>
-    <w:p>
-      <w:r>
         <w:rPr>
-          <w:b/>
+          <w:b w:val="0"/>
+          <w:i w:val="0"/>
         </w:rPr>
-        <w:t xml:space="preserve">Supported formulation: </w:t>
-      </w:r>
-      <w:r>
-        <w:t>V2 demonstrates that a represented organizational authority boundary can become a causal execution control within the harness. It does not demonstrate that the organization chose the correct boundary, that the lineage producing an already-created boundary remains legitimate, or that the authority basis remains current through a later state transition before execution.</w:t>
-      </w:r>
-    </w:p>
-    <w:p>
-      <w:r>
-        <w:rPr>
-          <w:b/>
-        </w:rPr>
-        <w:t xml:space="preserve">This is not a weakening of the historical result. </w:t>
-      </w:r>
-      <w:r>
-        <w:t>It is a more precise boundary around what the combined evidence supports and what remains untested, unrepresented, or unresolved.</w:t>
-      </w:r>
-    </w:p>
-    <w:p>
-      <w:pPr>
-        <w:pStyle w:val="Heading1"/>
-        <w:keepNext/>
-      </w:pPr>
-      <w:r>
-        <w:t>9. Required Next Steps Before Any V2 Change</w:t>
-      </w:r>
-    </w:p>
-    <w:p>
-      <w:pPr>
-        <w:pStyle w:val="ListNumber"/>
-      </w:pPr>
-      <w:r>
-        <w:t>Preserve this cross-review record without altering either reviewer's frozen source evidence.</w:t>
-      </w:r>
-    </w:p>
-    <w:p>
-      <w:pPr>
-        <w:pStyle w:val="ListNumber"/>
-      </w:pPr>
-      <w:r>
-        <w:t>Keep V2.0.0 and the public-review branch pinned to the frozen release while adjudication continues.</w:t>
-      </w:r>
-    </w:p>
-    <w:p>
-      <w:pPr>
-        <w:pStyle w:val="ListNumber"/>
-      </w:pPr>
-      <w:r>
-        <w:t>Reproduce and source-adjudicate Claude F-1 against frozen V2 before deciding remediation.</w:t>
-      </w:r>
-    </w:p>
-    <w:p>
-      <w:pPr>
-        <w:pStyle w:val="ListNumber"/>
-      </w:pPr>
-      <w:r>
-        <w:t>Adjudicate Claude F-2 against the governing Procurement semantics before labeling it an implementation defect or legitimate experimental result.</w:t>
-      </w:r>
-    </w:p>
-    <w:p>
-      <w:pPr>
-        <w:pStyle w:val="ListNumber"/>
-      </w:pPr>
-      <w:r>
-        <w:t>Keep the ACCESS order/history anomaly as not reproduced unless new evidence confirms it.</w:t>
-      </w:r>
-    </w:p>
-    <w:p>
-      <w:pPr>
-        <w:pStyle w:val="ListNumber"/>
-      </w:pPr>
-      <w:r>
-        <w:t>Treat temporal continuity, governing provenance, replay epoch-binding, and semantic decision-object identity as research/model boundaries unless evidence shows an implementation contradiction with V2's stated claims.</w:t>
-      </w:r>
-    </w:p>
-    <w:p>
-      <w:pPr>
-        <w:pStyle w:val="ListNumber"/>
-      </w:pPr>
-      <w:r>
-        <w:t>Do not introduce trust anchors, continuity rules, delegation chains, cryptographic binding, or other future architecture merely to make V2 survive these attacks.</w:t>
-      </w:r>
-    </w:p>
-    <w:p>
-      <w:pPr>
-        <w:pStyle w:val="ListNumber"/>
-      </w:pPr>
-      <w:r>
-        <w:t>Obtain Kelly's authorization before any material conceptual-model change.</w:t>
-      </w:r>
-    </w:p>
-    <w:p>
-      <w:pPr>
-        <w:pStyle w:val="Heading1"/>
-        <w:keepNext/>
-      </w:pPr>
-      <w:r>
-        <w:t>10. Independence and Disclosure Rule</w:t>
-      </w:r>
-    </w:p>
-    <w:p>
-      <w:r>
-        <w:t>Wojciech's frozen assessment predates exposure to Claude's findings. This cross-review comparison was created only after that independence boundary had been preserved. Any later discussion with Wojciech about Claude should be described as post-freeze comparison and must not be represented as part of his original independent assessment.</w:t>
-      </w:r>
-    </w:p>
-    <w:p>
-      <w:pPr>
-        <w:pStyle w:val="Heading1"/>
-        <w:keepNext/>
-      </w:pPr>
-      <w:r>
-        <w:t>11. Canonical Cross-Review Takeaway</w:t>
-      </w:r>
-    </w:p>
-    <w:p>
-      <w:r>
-        <w:rPr>
-          <w:b/>
-        </w:rPr>
-        <w:t xml:space="preserve">Combined evidence supports the central V2 mechanism while revealing important limits around evidence integrity, authority currentness, governing provenance, semantic identity, and substantive correctness of the authority boundary. </w:t>
-      </w:r>
-      <w:r>
-        <w:t>The appropriate response is not to patch every discovered boundary. The appropriate response is to preserve the evidence, adjudicate implementation defects separately from representation limits, and let future versions earn their scope by addressing research questions V2 cannot currently discriminate.</w:t>
-      </w:r>
-    </w:p>
-    <w:p>
-      <w:pPr>
-        <w:pStyle w:val="Heading1"/>
-        <w:keepNext/>
-      </w:pPr>
-      <w:r>
-        <w:t>Source Basis</w:t>
-      </w:r>
-    </w:p>
-    <w:p>
-      <w:pPr>
-        <w:pStyle w:val="ListBullet"/>
-      </w:pPr>
-      <w:r>
-        <w:t>Claude V2 Final Adversarial Review Record, including the preserved description of the 109-case final public review, F-1, F-2, REVIEW REQUIRED observations, and disclosed coverage limitations.</w:t>
-      </w:r>
-    </w:p>
-    <w:p>
-      <w:pPr>
-        <w:pStyle w:val="ListBullet"/>
-      </w:pPr>
-      <w:r>
-        <w:t>Corrected Wojciech V2 Final Independent Adversarial Assessment, reconciled against the preserved raw LinkedIn message thread. The nine frozen classifications are unchanged; the corrected synthesis additionally preserves the normal-governed-pipeline qualification, the attack-to-result ledger, and explicitly parked upstream research questions.</w:t>
-      </w:r>
-    </w:p>
-    <w:p>
-      <w:pPr>
-        <w:pStyle w:val="ListBullet"/>
-      </w:pPr>
-      <w:r>
-        <w:t>Operational AI Authority Test Harness governing instructions, especially claims discipline, test-harness-not-proof-machine principles, deterministic replay requirements, and the requirement to distinguish observed, demonstrated, supported, not demonstrated, and research-question claims.</w:t>
+        <w:t>No implementation repair is authorized by this document. F-1 may justify a separately governed reproduction and source-level adjudication. F-2 requires governing-specification adjudication before any repair classification. Temporal continuity, provenance, semantic identity, and causal/evidentiary fidelity remain research or representation questions unless separately activated.</w:t>
       </w:r>
     </w:p>
     <w:sectPr>
       <w:footerReference w:type="default" r:id="rId9"/>
       <w:pgSz w:w="12240" w:h="15840"/>
-      <w:pgMar w:top="979" w:right="1037" w:bottom="979" w:left="1037" w:header="720" w:footer="720" w:gutter="0"/>
+      <w:pgMar w:top="1037" w:right="1181" w:bottom="1037" w:left="1181" w:header="720" w:footer="720" w:gutter="0"/>
       <w:cols w:space="720"/>
       <w:docGrid w:linePitch="360"/>
     </w:sectPr>
@@ -2976,11 +2569,11 @@
     <w:qFormat/>
     <w:rsid w:val="00FC693F"/>
     <w:pPr>
-      <w:spacing w:after="100" w:line="254" w:lineRule="auto"/>
+      <w:spacing w:after="120" w:line="259" w:lineRule="auto"/>
     </w:pPr>
     <w:rPr>
       <w:rFonts w:ascii="Aptos" w:hAnsi="Aptos"/>
-      <w:sz w:val="20"/>
+      <w:sz w:val="21"/>
     </w:rPr>
   </w:style>
   <w:style w:type="paragraph" w:styleId="Header">
@@ -3046,7 +2639,7 @@
       <w:b/>
       <w:bCs/>
       <w:color w:val="1F4E79"/>
-      <w:sz w:val="31"/>
+      <w:sz w:val="30"/>
       <w:szCs w:val="28"/>
     </w:rPr>
   </w:style>
@@ -3069,8 +2662,8 @@
       <w:rFonts w:asciiTheme="majorHAnsi" w:eastAsiaTheme="majorEastAsia" w:hAnsiTheme="majorHAnsi" w:cstheme="majorBidi" w:ascii="Aptos Display" w:hAnsi="Aptos Display"/>
       <w:b/>
       <w:bCs/>
-      <w:color w:val="375623"/>
-      <w:sz w:val="25"/>
+      <w:color w:val="1F4E79"/>
+      <w:sz w:val="24"/>
       <w:szCs w:val="26"/>
     </w:rPr>
   </w:style>
@@ -3090,10 +2683,11 @@
       <w:outlineLvl w:val="2"/>
     </w:pPr>
     <w:rPr>
-      <w:rFonts w:asciiTheme="majorHAnsi" w:eastAsiaTheme="majorEastAsia" w:hAnsiTheme="majorHAnsi" w:cstheme="majorBidi" w:ascii="Aptos Display" w:hAnsi="Aptos Display"/>
+      <w:rFonts w:asciiTheme="majorHAnsi" w:eastAsiaTheme="majorEastAsia" w:hAnsiTheme="majorHAnsi" w:cstheme="majorBidi" w:ascii="Aptos" w:hAnsi="Aptos"/>
       <w:b/>
       <w:bCs/>
       <w:color w:val="4F81BD" w:themeColor="accent1"/>
+      <w:sz w:val="21"/>
     </w:rPr>
   </w:style>
   <w:style w:type="paragraph" w:styleId="Heading4">
@@ -3336,7 +2930,7 @@
       <w:color w:val="17365D" w:themeColor="text2" w:themeShade="BF"/>
       <w:spacing w:val="5"/>
       <w:kern w:val="28"/>
-      <w:sz w:val="46"/>
+      <w:sz w:val="44"/>
       <w:szCs w:val="52"/>
     </w:rPr>
   </w:style>
@@ -3369,12 +2963,12 @@
       </w:numPr>
     </w:pPr>
     <w:rPr>
-      <w:rFonts w:asciiTheme="majorHAnsi" w:eastAsiaTheme="majorEastAsia" w:hAnsiTheme="majorHAnsi" w:cstheme="majorBidi"/>
+      <w:rFonts w:asciiTheme="majorHAnsi" w:eastAsiaTheme="majorEastAsia" w:hAnsiTheme="majorHAnsi" w:cstheme="majorBidi" w:ascii="Aptos" w:hAnsi="Aptos"/>
       <w:i/>
       <w:iCs/>
       <w:color w:val="4F81BD" w:themeColor="accent1"/>
       <w:spacing w:val="15"/>
-      <w:sz w:val="24"/>
+      <w:sz w:val="22"/>
       <w:szCs w:val="24"/>
     </w:rPr>
   </w:style>

</xml_diff>